<commit_message>
Planning sheet: plainer prompts, colour-coded idea or effect, three to a side
Co-Authored-By: Claude Opus 5 <noreply@anthropic.com>
Claude-Session: https://claude.ai/code/session_01TX2KYiJGekMNoBBPASQh6e
</commit_message>
<xml_diff>
--- a/BoneSparrow-essay-planner.docx
+++ b/BoneSparrow-essay-planner.docx
@@ -5,9 +5,9 @@
     <w:p>
       <w:pPr>
         <w:tabs>
-          <w:tab w:val="right" w:pos="10106"/>
+          <w:tab w:val="right" w:pos="10306"/>
         </w:tabs>
-        <w:spacing w:after="60"/>
+        <w:spacing w:after="50"/>
       </w:pPr>
       <w:r>
         <w:rPr>
@@ -15,8 +15,8 @@
           <w:b/>
           <w:bCs/>
           <w:color w:val="1D3C34"/>
-          <w:sz w:val="28"/>
-          <w:szCs w:val="28"/>
+          <w:sz w:val="27"/>
+          <w:szCs w:val="27"/>
         </w:rPr>
         <w:t xml:space="preserve">The Bone Sparrow — planning three paragraphs</w:t>
       </w:r>
@@ -41,43 +41,85 @@
     </w:p>
     <w:p>
       <w:pPr>
-        <w:spacing w:after="200"/>
+        <w:spacing w:after="150"/>
       </w:pPr>
       <w:r>
         <w:rPr>
           <w:rFonts w:ascii="Calibri" w:cs="Calibri" w:eastAsia="Calibri" w:hAnsi="Calibri"/>
           <w:color w:val="645D54"/>
-          <w:sz w:val="20"/>
-          <w:szCs w:val="20"/>
+          <w:sz w:val="19"/>
+          <w:szCs w:val="19"/>
         </w:rPr>
         <w:t xml:space="preserve">Jot, don’t write sentences. A few words for the idea, a few words for the evidence.</w:t>
+      </w:r>
+      <w:r>
+        <w:rPr>
+          <w:rFonts w:ascii="Georgia" w:cs="Georgia" w:eastAsia="Georgia" w:hAnsi="Georgia"/>
+          <w:color w:val="1E211F"/>
+          <w:sz w:val="22"/>
+          <w:szCs w:val="22"/>
+        </w:rPr>
+        <w:t xml:space="preserve">      </w:t>
+      </w:r>
+      <w:r>
+        <w:rPr>
+          <w:rFonts w:ascii="Calibri" w:cs="Calibri" w:eastAsia="Calibri" w:hAnsi="Calibri"/>
+          <w:b/>
+          <w:bCs/>
+          <w:color w:val="0B447C"/>
+          <w:sz w:val="18"/>
+          <w:szCs w:val="18"/>
+          <w:shd w:fill="D6EAFC" w:val="clear"/>
+        </w:rPr>
+        <w:t xml:space="preserve">  idea  </w:t>
+      </w:r>
+      <w:r>
+        <w:rPr>
+          <w:rFonts w:ascii="Georgia" w:cs="Georgia" w:eastAsia="Georgia" w:hAnsi="Georgia"/>
+          <w:color w:val="1E211F"/>
+          <w:sz w:val="22"/>
+          <w:szCs w:val="22"/>
+        </w:rPr>
+        <w:t xml:space="preserve">   </w:t>
+      </w:r>
+      <w:r>
+        <w:rPr>
+          <w:rFonts w:ascii="Calibri" w:cs="Calibri" w:eastAsia="Calibri" w:hAnsi="Calibri"/>
+          <w:b/>
+          <w:bCs/>
+          <w:color w:val="1F5C33"/>
+          <w:sz w:val="18"/>
+          <w:szCs w:val="18"/>
+          <w:shd w:fill="DFF0E2" w:val="clear"/>
+        </w:rPr>
+        <w:t xml:space="preserve">  effect  </w:t>
       </w:r>
     </w:p>
     <w:tbl>
       <w:tblPr>
-        <w:tblW w:type="dxa" w:w="10106"/>
+        <w:tblW w:type="dxa" w:w="10306"/>
         <w:tblBorders>
-          <w:top w:val="single" w:color="1D3C34" w:sz="8"/>
-          <w:left w:val="single" w:color="1D3C34" w:sz="8"/>
-          <w:bottom w:val="single" w:color="1D3C34" w:sz="8"/>
-          <w:right w:val="single" w:color="1D3C34" w:sz="8"/>
+          <w:top w:val="single" w:color="0B447C" w:sz="8"/>
+          <w:left w:val="single" w:color="0B447C" w:sz="8"/>
+          <w:bottom w:val="single" w:color="0B447C" w:sz="8"/>
+          <w:right w:val="single" w:color="0B447C" w:sz="8"/>
           <w:insideH w:val="single" w:color="auto" w:sz="4"/>
           <w:insideV w:val="single" w:color="auto" w:sz="4"/>
         </w:tblBorders>
       </w:tblPr>
       <w:tblGrid>
-        <w:gridCol w:w="10106"/>
+        <w:gridCol w:w="10306"/>
       </w:tblGrid>
       <w:tr>
         <w:tc>
           <w:tcPr>
-            <w:tcW w:type="dxa" w:w="10106"/>
-            <w:shd w:fill="FBF7EE" w:color="auto" w:val="clear"/>
-            <w:tcMar>
-              <w:top w:type="dxa" w:w="130"/>
-              <w:left w:type="dxa" w:w="180"/>
-              <w:bottom w:type="dxa" w:w="130"/>
-              <w:right w:type="dxa" w:w="180"/>
+            <w:tcW w:type="dxa" w:w="10306"/>
+            <w:shd w:fill="D6EAFC" w:color="auto" w:val="clear"/>
+            <w:tcMar>
+              <w:top w:type="dxa" w:w="110"/>
+              <w:left w:type="dxa" w:w="170"/>
+              <w:bottom w:type="dxa" w:w="110"/>
+              <w:right w:type="dxa" w:w="170"/>
             </w:tcMar>
           </w:tcPr>
           <w:p>
@@ -98,11 +140,11 @@
             <w:r>
               <w:rPr>
                 <w:rFonts w:ascii="Georgia" w:cs="Georgia" w:eastAsia="Georgia" w:hAnsi="Georgia"/>
-                <w:color w:val="1E211F"/>
+                <w:color w:val="0B447C"/>
                 <w:sz w:val="23"/>
                 <w:szCs w:val="23"/>
               </w:rPr>
-              <w:t xml:space="preserve">The Bone Sparrow shows us that imagination and friendship are essential for survival.</w:t>
+              <w:t xml:space="preserve">The Bone Sparrow shows that imagination helps Subhi survive. Discuss.</w:t>
             </w:r>
           </w:p>
         </w:tc>
@@ -110,7 +152,7 @@
     </w:tbl>
     <w:tbl>
       <w:tblPr>
-        <w:tblW w:type="dxa" w:w="10106"/>
+        <w:tblW w:type="dxa" w:w="10306"/>
         <w:tblBorders>
           <w:top w:val="single" w:color="C9BFAE" w:sz="6"/>
           <w:left w:val="single" w:color="C9BFAE" w:sz="6"/>
@@ -121,45 +163,44 @@
         </w:tblBorders>
       </w:tblPr>
       <w:tblGrid>
-        <w:gridCol w:w="520"/>
-        <w:gridCol w:w="4793"/>
-        <w:gridCol w:w="4793"/>
+        <w:gridCol w:w="500"/>
+        <w:gridCol w:w="4903"/>
+        <w:gridCol w:w="4903"/>
       </w:tblGrid>
       <w:tr>
         <w:trPr>
-          <w:tblHeader/>
-          <w:trHeight w:val="340" w:hRule="atLeast"/>
+          <w:trHeight w:val="320" w:hRule="atLeast"/>
         </w:trPr>
         <w:tc>
           <w:tcPr>
-            <w:tcW w:type="dxa" w:w="520"/>
-            <w:tcMar>
-              <w:top w:type="dxa" w:w="70"/>
-              <w:left w:type="dxa" w:w="110"/>
-              <w:bottom w:type="dxa" w:w="70"/>
-              <w:right w:type="dxa" w:w="110"/>
-            </w:tcMar>
-          </w:tcPr>
-          <w:p>
-            <w:pPr>
-              <w:spacing w:after="0"/>
-            </w:pPr>
-            <w:r>
-              <w:rPr>
-                <w:sz w:val="22"/>
-                <w:szCs w:val="22"/>
-              </w:rPr>
-              <w:t xml:space="preserve"/>
-            </w:r>
-          </w:p>
-        </w:tc>
-        <w:tc>
-          <w:tcPr>
-            <w:tcW w:type="dxa" w:w="4793"/>
-            <w:tcMar>
-              <w:top w:type="dxa" w:w="70"/>
-              <w:left w:type="dxa" w:w="110"/>
-              <w:bottom w:type="dxa" w:w="70"/>
+            <w:tcW w:type="dxa" w:w="500"/>
+            <w:tcMar>
+              <w:top w:type="dxa" w:w="60"/>
+              <w:left w:type="dxa" w:w="110"/>
+              <w:bottom w:type="dxa" w:w="60"/>
+              <w:right w:type="dxa" w:w="110"/>
+            </w:tcMar>
+          </w:tcPr>
+          <w:p>
+            <w:pPr>
+              <w:spacing w:after="0"/>
+            </w:pPr>
+            <w:r>
+              <w:rPr>
+                <w:sz w:val="22"/>
+                <w:szCs w:val="22"/>
+              </w:rPr>
+              <w:t xml:space="preserve"/>
+            </w:r>
+          </w:p>
+        </w:tc>
+        <w:tc>
+          <w:tcPr>
+            <w:tcW w:type="dxa" w:w="4903"/>
+            <w:tcMar>
+              <w:top w:type="dxa" w:w="60"/>
+              <w:left w:type="dxa" w:w="110"/>
+              <w:bottom w:type="dxa" w:w="60"/>
               <w:right w:type="dxa" w:w="110"/>
             </w:tcMar>
           </w:tcPr>
@@ -183,11 +224,11 @@
         </w:tc>
         <w:tc>
           <w:tcPr>
-            <w:tcW w:type="dxa" w:w="4793"/>
-            <w:tcMar>
-              <w:top w:type="dxa" w:w="70"/>
-              <w:left w:type="dxa" w:w="110"/>
-              <w:bottom w:type="dxa" w:w="70"/>
+            <w:tcW w:type="dxa" w:w="4903"/>
+            <w:tcMar>
+              <w:top w:type="dxa" w:w="60"/>
+              <w:left w:type="dxa" w:w="110"/>
+              <w:bottom w:type="dxa" w:w="60"/>
               <w:right w:type="dxa" w:w="110"/>
             </w:tcMar>
           </w:tcPr>
@@ -212,15 +253,15 @@
       </w:tr>
       <w:tr>
         <w:trPr>
-          <w:trHeight w:val="1150" w:hRule="atLeast"/>
+          <w:trHeight w:val="1000" w:hRule="atLeast"/>
         </w:trPr>
         <w:tc>
           <w:tcPr>
-            <w:tcW w:type="dxa" w:w="520"/>
-            <w:tcMar>
-              <w:top w:type="dxa" w:w="70"/>
-              <w:left w:type="dxa" w:w="110"/>
-              <w:bottom w:type="dxa" w:w="70"/>
+            <w:tcW w:type="dxa" w:w="500"/>
+            <w:tcMar>
+              <w:top w:type="dxa" w:w="60"/>
+              <w:left w:type="dxa" w:w="110"/>
+              <w:bottom w:type="dxa" w:w="60"/>
               <w:right w:type="dxa" w:w="110"/>
             </w:tcMar>
           </w:tcPr>
@@ -243,34 +284,34 @@
         </w:tc>
         <w:tc>
           <w:tcPr>
-            <w:tcW w:type="dxa" w:w="4793"/>
-            <w:tcMar>
-              <w:top w:type="dxa" w:w="70"/>
-              <w:left w:type="dxa" w:w="110"/>
-              <w:bottom w:type="dxa" w:w="70"/>
-              <w:right w:type="dxa" w:w="110"/>
-            </w:tcMar>
-          </w:tcPr>
-          <w:p>
-            <w:pPr>
-              <w:spacing w:after="0"/>
-            </w:pPr>
-            <w:r>
-              <w:rPr>
-                <w:sz w:val="22"/>
-                <w:szCs w:val="22"/>
-              </w:rPr>
-              <w:t xml:space="preserve"/>
-            </w:r>
-          </w:p>
-        </w:tc>
-        <w:tc>
-          <w:tcPr>
-            <w:tcW w:type="dxa" w:w="4793"/>
-            <w:tcMar>
-              <w:top w:type="dxa" w:w="70"/>
-              <w:left w:type="dxa" w:w="110"/>
-              <w:bottom w:type="dxa" w:w="70"/>
+            <w:tcW w:type="dxa" w:w="4903"/>
+            <w:tcMar>
+              <w:top w:type="dxa" w:w="60"/>
+              <w:left w:type="dxa" w:w="110"/>
+              <w:bottom w:type="dxa" w:w="60"/>
+              <w:right w:type="dxa" w:w="110"/>
+            </w:tcMar>
+          </w:tcPr>
+          <w:p>
+            <w:pPr>
+              <w:spacing w:after="0"/>
+            </w:pPr>
+            <w:r>
+              <w:rPr>
+                <w:sz w:val="22"/>
+                <w:szCs w:val="22"/>
+              </w:rPr>
+              <w:t xml:space="preserve"/>
+            </w:r>
+          </w:p>
+        </w:tc>
+        <w:tc>
+          <w:tcPr>
+            <w:tcW w:type="dxa" w:w="4903"/>
+            <w:tcMar>
+              <w:top w:type="dxa" w:w="60"/>
+              <w:left w:type="dxa" w:w="110"/>
+              <w:bottom w:type="dxa" w:w="60"/>
               <w:right w:type="dxa" w:w="110"/>
             </w:tcMar>
           </w:tcPr>
@@ -290,15 +331,15 @@
       </w:tr>
       <w:tr>
         <w:trPr>
-          <w:trHeight w:val="1150" w:hRule="atLeast"/>
+          <w:trHeight w:val="1000" w:hRule="atLeast"/>
         </w:trPr>
         <w:tc>
           <w:tcPr>
-            <w:tcW w:type="dxa" w:w="520"/>
-            <w:tcMar>
-              <w:top w:type="dxa" w:w="70"/>
-              <w:left w:type="dxa" w:w="110"/>
-              <w:bottom w:type="dxa" w:w="70"/>
+            <w:tcW w:type="dxa" w:w="500"/>
+            <w:tcMar>
+              <w:top w:type="dxa" w:w="60"/>
+              <w:left w:type="dxa" w:w="110"/>
+              <w:bottom w:type="dxa" w:w="60"/>
               <w:right w:type="dxa" w:w="110"/>
             </w:tcMar>
           </w:tcPr>
@@ -321,34 +362,34 @@
         </w:tc>
         <w:tc>
           <w:tcPr>
-            <w:tcW w:type="dxa" w:w="4793"/>
-            <w:tcMar>
-              <w:top w:type="dxa" w:w="70"/>
-              <w:left w:type="dxa" w:w="110"/>
-              <w:bottom w:type="dxa" w:w="70"/>
-              <w:right w:type="dxa" w:w="110"/>
-            </w:tcMar>
-          </w:tcPr>
-          <w:p>
-            <w:pPr>
-              <w:spacing w:after="0"/>
-            </w:pPr>
-            <w:r>
-              <w:rPr>
-                <w:sz w:val="22"/>
-                <w:szCs w:val="22"/>
-              </w:rPr>
-              <w:t xml:space="preserve"/>
-            </w:r>
-          </w:p>
-        </w:tc>
-        <w:tc>
-          <w:tcPr>
-            <w:tcW w:type="dxa" w:w="4793"/>
-            <w:tcMar>
-              <w:top w:type="dxa" w:w="70"/>
-              <w:left w:type="dxa" w:w="110"/>
-              <w:bottom w:type="dxa" w:w="70"/>
+            <w:tcW w:type="dxa" w:w="4903"/>
+            <w:tcMar>
+              <w:top w:type="dxa" w:w="60"/>
+              <w:left w:type="dxa" w:w="110"/>
+              <w:bottom w:type="dxa" w:w="60"/>
+              <w:right w:type="dxa" w:w="110"/>
+            </w:tcMar>
+          </w:tcPr>
+          <w:p>
+            <w:pPr>
+              <w:spacing w:after="0"/>
+            </w:pPr>
+            <w:r>
+              <w:rPr>
+                <w:sz w:val="22"/>
+                <w:szCs w:val="22"/>
+              </w:rPr>
+              <w:t xml:space="preserve"/>
+            </w:r>
+          </w:p>
+        </w:tc>
+        <w:tc>
+          <w:tcPr>
+            <w:tcW w:type="dxa" w:w="4903"/>
+            <w:tcMar>
+              <w:top w:type="dxa" w:w="60"/>
+              <w:left w:type="dxa" w:w="110"/>
+              <w:bottom w:type="dxa" w:w="60"/>
               <w:right w:type="dxa" w:w="110"/>
             </w:tcMar>
           </w:tcPr>
@@ -368,15 +409,15 @@
       </w:tr>
       <w:tr>
         <w:trPr>
-          <w:trHeight w:val="1150" w:hRule="atLeast"/>
+          <w:trHeight w:val="1000" w:hRule="atLeast"/>
         </w:trPr>
         <w:tc>
           <w:tcPr>
-            <w:tcW w:type="dxa" w:w="520"/>
-            <w:tcMar>
-              <w:top w:type="dxa" w:w="70"/>
-              <w:left w:type="dxa" w:w="110"/>
-              <w:bottom w:type="dxa" w:w="70"/>
+            <w:tcW w:type="dxa" w:w="500"/>
+            <w:tcMar>
+              <w:top w:type="dxa" w:w="60"/>
+              <w:left w:type="dxa" w:w="110"/>
+              <w:bottom w:type="dxa" w:w="60"/>
               <w:right w:type="dxa" w:w="110"/>
             </w:tcMar>
           </w:tcPr>
@@ -399,34 +440,34 @@
         </w:tc>
         <w:tc>
           <w:tcPr>
-            <w:tcW w:type="dxa" w:w="4793"/>
-            <w:tcMar>
-              <w:top w:type="dxa" w:w="70"/>
-              <w:left w:type="dxa" w:w="110"/>
-              <w:bottom w:type="dxa" w:w="70"/>
-              <w:right w:type="dxa" w:w="110"/>
-            </w:tcMar>
-          </w:tcPr>
-          <w:p>
-            <w:pPr>
-              <w:spacing w:after="0"/>
-            </w:pPr>
-            <w:r>
-              <w:rPr>
-                <w:sz w:val="22"/>
-                <w:szCs w:val="22"/>
-              </w:rPr>
-              <w:t xml:space="preserve"/>
-            </w:r>
-          </w:p>
-        </w:tc>
-        <w:tc>
-          <w:tcPr>
-            <w:tcW w:type="dxa" w:w="4793"/>
-            <w:tcMar>
-              <w:top w:type="dxa" w:w="70"/>
-              <w:left w:type="dxa" w:w="110"/>
-              <w:bottom w:type="dxa" w:w="70"/>
+            <w:tcW w:type="dxa" w:w="4903"/>
+            <w:tcMar>
+              <w:top w:type="dxa" w:w="60"/>
+              <w:left w:type="dxa" w:w="110"/>
+              <w:bottom w:type="dxa" w:w="60"/>
+              <w:right w:type="dxa" w:w="110"/>
+            </w:tcMar>
+          </w:tcPr>
+          <w:p>
+            <w:pPr>
+              <w:spacing w:after="0"/>
+            </w:pPr>
+            <w:r>
+              <w:rPr>
+                <w:sz w:val="22"/>
+                <w:szCs w:val="22"/>
+              </w:rPr>
+              <w:t xml:space="preserve"/>
+            </w:r>
+          </w:p>
+        </w:tc>
+        <w:tc>
+          <w:tcPr>
+            <w:tcW w:type="dxa" w:w="4903"/>
+            <w:tcMar>
+              <w:top w:type="dxa" w:w="60"/>
+              <w:left w:type="dxa" w:w="110"/>
+              <w:bottom w:type="dxa" w:w="60"/>
               <w:right w:type="dxa" w:w="110"/>
             </w:tcMar>
           </w:tcPr>
@@ -447,34 +488,34 @@
     </w:tbl>
     <w:p>
       <w:pPr>
-        <w:spacing w:after="180"/>
+        <w:spacing w:after="140"/>
       </w:pPr>
     </w:p>
     <w:tbl>
       <w:tblPr>
-        <w:tblW w:type="dxa" w:w="10106"/>
+        <w:tblW w:type="dxa" w:w="10306"/>
         <w:tblBorders>
-          <w:top w:val="single" w:color="1D3C34" w:sz="8"/>
-          <w:left w:val="single" w:color="1D3C34" w:sz="8"/>
-          <w:bottom w:val="single" w:color="1D3C34" w:sz="8"/>
-          <w:right w:val="single" w:color="1D3C34" w:sz="8"/>
+          <w:top w:val="single" w:color="0B447C" w:sz="8"/>
+          <w:left w:val="single" w:color="0B447C" w:sz="8"/>
+          <w:bottom w:val="single" w:color="0B447C" w:sz="8"/>
+          <w:right w:val="single" w:color="0B447C" w:sz="8"/>
           <w:insideH w:val="single" w:color="auto" w:sz="4"/>
           <w:insideV w:val="single" w:color="auto" w:sz="4"/>
         </w:tblBorders>
       </w:tblPr>
       <w:tblGrid>
-        <w:gridCol w:w="10106"/>
+        <w:gridCol w:w="10306"/>
       </w:tblGrid>
       <w:tr>
         <w:tc>
           <w:tcPr>
-            <w:tcW w:type="dxa" w:w="10106"/>
-            <w:shd w:fill="FBF7EE" w:color="auto" w:val="clear"/>
-            <w:tcMar>
-              <w:top w:type="dxa" w:w="130"/>
-              <w:left w:type="dxa" w:w="180"/>
-              <w:bottom w:type="dxa" w:w="130"/>
-              <w:right w:type="dxa" w:w="180"/>
+            <w:tcW w:type="dxa" w:w="10306"/>
+            <w:shd w:fill="D6EAFC" w:color="auto" w:val="clear"/>
+            <w:tcMar>
+              <w:top w:type="dxa" w:w="110"/>
+              <w:left w:type="dxa" w:w="170"/>
+              <w:bottom w:type="dxa" w:w="110"/>
+              <w:right w:type="dxa" w:w="170"/>
             </w:tcMar>
           </w:tcPr>
           <w:p>
@@ -495,11 +536,11 @@
             <w:r>
               <w:rPr>
                 <w:rFonts w:ascii="Georgia" w:cs="Georgia" w:eastAsia="Georgia" w:hAnsi="Georgia"/>
-                <w:color w:val="1E211F"/>
+                <w:color w:val="0B447C"/>
                 <w:sz w:val="23"/>
                 <w:szCs w:val="23"/>
               </w:rPr>
-              <w:t xml:space="preserve">In The Bone Sparrow, power comes in many forms.</w:t>
+              <w:t xml:space="preserve">Friendship changes Subhi’s life in The Bone Sparrow. Discuss.</w:t>
             </w:r>
           </w:p>
         </w:tc>
@@ -507,7 +548,7 @@
     </w:tbl>
     <w:tbl>
       <w:tblPr>
-        <w:tblW w:type="dxa" w:w="10106"/>
+        <w:tblW w:type="dxa" w:w="10306"/>
         <w:tblBorders>
           <w:top w:val="single" w:color="C9BFAE" w:sz="6"/>
           <w:left w:val="single" w:color="C9BFAE" w:sz="6"/>
@@ -518,45 +559,44 @@
         </w:tblBorders>
       </w:tblPr>
       <w:tblGrid>
-        <w:gridCol w:w="520"/>
-        <w:gridCol w:w="4793"/>
-        <w:gridCol w:w="4793"/>
+        <w:gridCol w:w="500"/>
+        <w:gridCol w:w="4903"/>
+        <w:gridCol w:w="4903"/>
       </w:tblGrid>
       <w:tr>
         <w:trPr>
-          <w:tblHeader/>
-          <w:trHeight w:val="340" w:hRule="atLeast"/>
+          <w:trHeight w:val="320" w:hRule="atLeast"/>
         </w:trPr>
         <w:tc>
           <w:tcPr>
-            <w:tcW w:type="dxa" w:w="520"/>
-            <w:tcMar>
-              <w:top w:type="dxa" w:w="70"/>
-              <w:left w:type="dxa" w:w="110"/>
-              <w:bottom w:type="dxa" w:w="70"/>
-              <w:right w:type="dxa" w:w="110"/>
-            </w:tcMar>
-          </w:tcPr>
-          <w:p>
-            <w:pPr>
-              <w:spacing w:after="0"/>
-            </w:pPr>
-            <w:r>
-              <w:rPr>
-                <w:sz w:val="22"/>
-                <w:szCs w:val="22"/>
-              </w:rPr>
-              <w:t xml:space="preserve"/>
-            </w:r>
-          </w:p>
-        </w:tc>
-        <w:tc>
-          <w:tcPr>
-            <w:tcW w:type="dxa" w:w="4793"/>
-            <w:tcMar>
-              <w:top w:type="dxa" w:w="70"/>
-              <w:left w:type="dxa" w:w="110"/>
-              <w:bottom w:type="dxa" w:w="70"/>
+            <w:tcW w:type="dxa" w:w="500"/>
+            <w:tcMar>
+              <w:top w:type="dxa" w:w="60"/>
+              <w:left w:type="dxa" w:w="110"/>
+              <w:bottom w:type="dxa" w:w="60"/>
+              <w:right w:type="dxa" w:w="110"/>
+            </w:tcMar>
+          </w:tcPr>
+          <w:p>
+            <w:pPr>
+              <w:spacing w:after="0"/>
+            </w:pPr>
+            <w:r>
+              <w:rPr>
+                <w:sz w:val="22"/>
+                <w:szCs w:val="22"/>
+              </w:rPr>
+              <w:t xml:space="preserve"/>
+            </w:r>
+          </w:p>
+        </w:tc>
+        <w:tc>
+          <w:tcPr>
+            <w:tcW w:type="dxa" w:w="4903"/>
+            <w:tcMar>
+              <w:top w:type="dxa" w:w="60"/>
+              <w:left w:type="dxa" w:w="110"/>
+              <w:bottom w:type="dxa" w:w="60"/>
               <w:right w:type="dxa" w:w="110"/>
             </w:tcMar>
           </w:tcPr>
@@ -580,11 +620,11 @@
         </w:tc>
         <w:tc>
           <w:tcPr>
-            <w:tcW w:type="dxa" w:w="4793"/>
-            <w:tcMar>
-              <w:top w:type="dxa" w:w="70"/>
-              <w:left w:type="dxa" w:w="110"/>
-              <w:bottom w:type="dxa" w:w="70"/>
+            <w:tcW w:type="dxa" w:w="4903"/>
+            <w:tcMar>
+              <w:top w:type="dxa" w:w="60"/>
+              <w:left w:type="dxa" w:w="110"/>
+              <w:bottom w:type="dxa" w:w="60"/>
               <w:right w:type="dxa" w:w="110"/>
             </w:tcMar>
           </w:tcPr>
@@ -609,15 +649,15 @@
       </w:tr>
       <w:tr>
         <w:trPr>
-          <w:trHeight w:val="1150" w:hRule="atLeast"/>
+          <w:trHeight w:val="1000" w:hRule="atLeast"/>
         </w:trPr>
         <w:tc>
           <w:tcPr>
-            <w:tcW w:type="dxa" w:w="520"/>
-            <w:tcMar>
-              <w:top w:type="dxa" w:w="70"/>
-              <w:left w:type="dxa" w:w="110"/>
-              <w:bottom w:type="dxa" w:w="70"/>
+            <w:tcW w:type="dxa" w:w="500"/>
+            <w:tcMar>
+              <w:top w:type="dxa" w:w="60"/>
+              <w:left w:type="dxa" w:w="110"/>
+              <w:bottom w:type="dxa" w:w="60"/>
               <w:right w:type="dxa" w:w="110"/>
             </w:tcMar>
           </w:tcPr>
@@ -640,34 +680,34 @@
         </w:tc>
         <w:tc>
           <w:tcPr>
-            <w:tcW w:type="dxa" w:w="4793"/>
-            <w:tcMar>
-              <w:top w:type="dxa" w:w="70"/>
-              <w:left w:type="dxa" w:w="110"/>
-              <w:bottom w:type="dxa" w:w="70"/>
-              <w:right w:type="dxa" w:w="110"/>
-            </w:tcMar>
-          </w:tcPr>
-          <w:p>
-            <w:pPr>
-              <w:spacing w:after="0"/>
-            </w:pPr>
-            <w:r>
-              <w:rPr>
-                <w:sz w:val="22"/>
-                <w:szCs w:val="22"/>
-              </w:rPr>
-              <w:t xml:space="preserve"/>
-            </w:r>
-          </w:p>
-        </w:tc>
-        <w:tc>
-          <w:tcPr>
-            <w:tcW w:type="dxa" w:w="4793"/>
-            <w:tcMar>
-              <w:top w:type="dxa" w:w="70"/>
-              <w:left w:type="dxa" w:w="110"/>
-              <w:bottom w:type="dxa" w:w="70"/>
+            <w:tcW w:type="dxa" w:w="4903"/>
+            <w:tcMar>
+              <w:top w:type="dxa" w:w="60"/>
+              <w:left w:type="dxa" w:w="110"/>
+              <w:bottom w:type="dxa" w:w="60"/>
+              <w:right w:type="dxa" w:w="110"/>
+            </w:tcMar>
+          </w:tcPr>
+          <w:p>
+            <w:pPr>
+              <w:spacing w:after="0"/>
+            </w:pPr>
+            <w:r>
+              <w:rPr>
+                <w:sz w:val="22"/>
+                <w:szCs w:val="22"/>
+              </w:rPr>
+              <w:t xml:space="preserve"/>
+            </w:r>
+          </w:p>
+        </w:tc>
+        <w:tc>
+          <w:tcPr>
+            <w:tcW w:type="dxa" w:w="4903"/>
+            <w:tcMar>
+              <w:top w:type="dxa" w:w="60"/>
+              <w:left w:type="dxa" w:w="110"/>
+              <w:bottom w:type="dxa" w:w="60"/>
               <w:right w:type="dxa" w:w="110"/>
             </w:tcMar>
           </w:tcPr>
@@ -687,15 +727,15 @@
       </w:tr>
       <w:tr>
         <w:trPr>
-          <w:trHeight w:val="1150" w:hRule="atLeast"/>
+          <w:trHeight w:val="1000" w:hRule="atLeast"/>
         </w:trPr>
         <w:tc>
           <w:tcPr>
-            <w:tcW w:type="dxa" w:w="520"/>
-            <w:tcMar>
-              <w:top w:type="dxa" w:w="70"/>
-              <w:left w:type="dxa" w:w="110"/>
-              <w:bottom w:type="dxa" w:w="70"/>
+            <w:tcW w:type="dxa" w:w="500"/>
+            <w:tcMar>
+              <w:top w:type="dxa" w:w="60"/>
+              <w:left w:type="dxa" w:w="110"/>
+              <w:bottom w:type="dxa" w:w="60"/>
               <w:right w:type="dxa" w:w="110"/>
             </w:tcMar>
           </w:tcPr>
@@ -718,34 +758,34 @@
         </w:tc>
         <w:tc>
           <w:tcPr>
-            <w:tcW w:type="dxa" w:w="4793"/>
-            <w:tcMar>
-              <w:top w:type="dxa" w:w="70"/>
-              <w:left w:type="dxa" w:w="110"/>
-              <w:bottom w:type="dxa" w:w="70"/>
-              <w:right w:type="dxa" w:w="110"/>
-            </w:tcMar>
-          </w:tcPr>
-          <w:p>
-            <w:pPr>
-              <w:spacing w:after="0"/>
-            </w:pPr>
-            <w:r>
-              <w:rPr>
-                <w:sz w:val="22"/>
-                <w:szCs w:val="22"/>
-              </w:rPr>
-              <w:t xml:space="preserve"/>
-            </w:r>
-          </w:p>
-        </w:tc>
-        <w:tc>
-          <w:tcPr>
-            <w:tcW w:type="dxa" w:w="4793"/>
-            <w:tcMar>
-              <w:top w:type="dxa" w:w="70"/>
-              <w:left w:type="dxa" w:w="110"/>
-              <w:bottom w:type="dxa" w:w="70"/>
+            <w:tcW w:type="dxa" w:w="4903"/>
+            <w:tcMar>
+              <w:top w:type="dxa" w:w="60"/>
+              <w:left w:type="dxa" w:w="110"/>
+              <w:bottom w:type="dxa" w:w="60"/>
+              <w:right w:type="dxa" w:w="110"/>
+            </w:tcMar>
+          </w:tcPr>
+          <w:p>
+            <w:pPr>
+              <w:spacing w:after="0"/>
+            </w:pPr>
+            <w:r>
+              <w:rPr>
+                <w:sz w:val="22"/>
+                <w:szCs w:val="22"/>
+              </w:rPr>
+              <w:t xml:space="preserve"/>
+            </w:r>
+          </w:p>
+        </w:tc>
+        <w:tc>
+          <w:tcPr>
+            <w:tcW w:type="dxa" w:w="4903"/>
+            <w:tcMar>
+              <w:top w:type="dxa" w:w="60"/>
+              <w:left w:type="dxa" w:w="110"/>
+              <w:bottom w:type="dxa" w:w="60"/>
               <w:right w:type="dxa" w:w="110"/>
             </w:tcMar>
           </w:tcPr>
@@ -765,15 +805,15 @@
       </w:tr>
       <w:tr>
         <w:trPr>
-          <w:trHeight w:val="1150" w:hRule="atLeast"/>
+          <w:trHeight w:val="1000" w:hRule="atLeast"/>
         </w:trPr>
         <w:tc>
           <w:tcPr>
-            <w:tcW w:type="dxa" w:w="520"/>
-            <w:tcMar>
-              <w:top w:type="dxa" w:w="70"/>
-              <w:left w:type="dxa" w:w="110"/>
-              <w:bottom w:type="dxa" w:w="70"/>
+            <w:tcW w:type="dxa" w:w="500"/>
+            <w:tcMar>
+              <w:top w:type="dxa" w:w="60"/>
+              <w:left w:type="dxa" w:w="110"/>
+              <w:bottom w:type="dxa" w:w="60"/>
               <w:right w:type="dxa" w:w="110"/>
             </w:tcMar>
           </w:tcPr>
@@ -796,34 +836,34 @@
         </w:tc>
         <w:tc>
           <w:tcPr>
-            <w:tcW w:type="dxa" w:w="4793"/>
-            <w:tcMar>
-              <w:top w:type="dxa" w:w="70"/>
-              <w:left w:type="dxa" w:w="110"/>
-              <w:bottom w:type="dxa" w:w="70"/>
-              <w:right w:type="dxa" w:w="110"/>
-            </w:tcMar>
-          </w:tcPr>
-          <w:p>
-            <w:pPr>
-              <w:spacing w:after="0"/>
-            </w:pPr>
-            <w:r>
-              <w:rPr>
-                <w:sz w:val="22"/>
-                <w:szCs w:val="22"/>
-              </w:rPr>
-              <w:t xml:space="preserve"/>
-            </w:r>
-          </w:p>
-        </w:tc>
-        <w:tc>
-          <w:tcPr>
-            <w:tcW w:type="dxa" w:w="4793"/>
-            <w:tcMar>
-              <w:top w:type="dxa" w:w="70"/>
-              <w:left w:type="dxa" w:w="110"/>
-              <w:bottom w:type="dxa" w:w="70"/>
+            <w:tcW w:type="dxa" w:w="4903"/>
+            <w:tcMar>
+              <w:top w:type="dxa" w:w="60"/>
+              <w:left w:type="dxa" w:w="110"/>
+              <w:bottom w:type="dxa" w:w="60"/>
+              <w:right w:type="dxa" w:w="110"/>
+            </w:tcMar>
+          </w:tcPr>
+          <w:p>
+            <w:pPr>
+              <w:spacing w:after="0"/>
+            </w:pPr>
+            <w:r>
+              <w:rPr>
+                <w:sz w:val="22"/>
+                <w:szCs w:val="22"/>
+              </w:rPr>
+              <w:t xml:space="preserve"/>
+            </w:r>
+          </w:p>
+        </w:tc>
+        <w:tc>
+          <w:tcPr>
+            <w:tcW w:type="dxa" w:w="4903"/>
+            <w:tcMar>
+              <w:top w:type="dxa" w:w="60"/>
+              <w:left w:type="dxa" w:w="110"/>
+              <w:bottom w:type="dxa" w:w="60"/>
               <w:right w:type="dxa" w:w="110"/>
             </w:tcMar>
           </w:tcPr>
@@ -844,34 +884,34 @@
     </w:tbl>
     <w:p>
       <w:pPr>
-        <w:spacing w:after="180"/>
+        <w:spacing w:after="140"/>
       </w:pPr>
     </w:p>
     <w:tbl>
       <w:tblPr>
-        <w:tblW w:type="dxa" w:w="10106"/>
+        <w:tblW w:type="dxa" w:w="10306"/>
         <w:tblBorders>
-          <w:top w:val="single" w:color="1D3C34" w:sz="8"/>
-          <w:left w:val="single" w:color="1D3C34" w:sz="8"/>
-          <w:bottom w:val="single" w:color="1D3C34" w:sz="8"/>
-          <w:right w:val="single" w:color="1D3C34" w:sz="8"/>
+          <w:top w:val="single" w:color="0B447C" w:sz="8"/>
+          <w:left w:val="single" w:color="0B447C" w:sz="8"/>
+          <w:bottom w:val="single" w:color="0B447C" w:sz="8"/>
+          <w:right w:val="single" w:color="0B447C" w:sz="8"/>
           <w:insideH w:val="single" w:color="auto" w:sz="4"/>
           <w:insideV w:val="single" w:color="auto" w:sz="4"/>
         </w:tblBorders>
       </w:tblPr>
       <w:tblGrid>
-        <w:gridCol w:w="10106"/>
+        <w:gridCol w:w="10306"/>
       </w:tblGrid>
       <w:tr>
         <w:tc>
           <w:tcPr>
-            <w:tcW w:type="dxa" w:w="10106"/>
-            <w:shd w:fill="FBF7EE" w:color="auto" w:val="clear"/>
-            <w:tcMar>
-              <w:top w:type="dxa" w:w="130"/>
-              <w:left w:type="dxa" w:w="180"/>
-              <w:bottom w:type="dxa" w:w="130"/>
-              <w:right w:type="dxa" w:w="180"/>
+            <w:tcW w:type="dxa" w:w="10306"/>
+            <w:shd w:fill="D6EAFC" w:color="auto" w:val="clear"/>
+            <w:tcMar>
+              <w:top w:type="dxa" w:w="110"/>
+              <w:left w:type="dxa" w:w="170"/>
+              <w:bottom w:type="dxa" w:w="110"/>
+              <w:right w:type="dxa" w:w="170"/>
             </w:tcMar>
           </w:tcPr>
           <w:p>
@@ -892,11 +932,11 @@
             <w:r>
               <w:rPr>
                 <w:rFonts w:ascii="Georgia" w:cs="Georgia" w:eastAsia="Georgia" w:hAnsi="Georgia"/>
-                <w:color w:val="1E211F"/>
+                <w:color w:val="0B447C"/>
                 <w:sz w:val="23"/>
                 <w:szCs w:val="23"/>
               </w:rPr>
-              <w:t xml:space="preserve">Fraillon makes the reader see the people behind the numbers.</w:t>
+              <w:t xml:space="preserve">In The Bone Sparrow, the people with power control everything. Do you agree?</w:t>
             </w:r>
           </w:p>
         </w:tc>
@@ -904,7 +944,7 @@
     </w:tbl>
     <w:tbl>
       <w:tblPr>
-        <w:tblW w:type="dxa" w:w="10106"/>
+        <w:tblW w:type="dxa" w:w="10306"/>
         <w:tblBorders>
           <w:top w:val="single" w:color="C9BFAE" w:sz="6"/>
           <w:left w:val="single" w:color="C9BFAE" w:sz="6"/>
@@ -915,45 +955,44 @@
         </w:tblBorders>
       </w:tblPr>
       <w:tblGrid>
-        <w:gridCol w:w="520"/>
-        <w:gridCol w:w="4793"/>
-        <w:gridCol w:w="4793"/>
+        <w:gridCol w:w="500"/>
+        <w:gridCol w:w="4903"/>
+        <w:gridCol w:w="4903"/>
       </w:tblGrid>
       <w:tr>
         <w:trPr>
-          <w:tblHeader/>
-          <w:trHeight w:val="340" w:hRule="atLeast"/>
+          <w:trHeight w:val="320" w:hRule="atLeast"/>
         </w:trPr>
         <w:tc>
           <w:tcPr>
-            <w:tcW w:type="dxa" w:w="520"/>
-            <w:tcMar>
-              <w:top w:type="dxa" w:w="70"/>
-              <w:left w:type="dxa" w:w="110"/>
-              <w:bottom w:type="dxa" w:w="70"/>
-              <w:right w:type="dxa" w:w="110"/>
-            </w:tcMar>
-          </w:tcPr>
-          <w:p>
-            <w:pPr>
-              <w:spacing w:after="0"/>
-            </w:pPr>
-            <w:r>
-              <w:rPr>
-                <w:sz w:val="22"/>
-                <w:szCs w:val="22"/>
-              </w:rPr>
-              <w:t xml:space="preserve"/>
-            </w:r>
-          </w:p>
-        </w:tc>
-        <w:tc>
-          <w:tcPr>
-            <w:tcW w:type="dxa" w:w="4793"/>
-            <w:tcMar>
-              <w:top w:type="dxa" w:w="70"/>
-              <w:left w:type="dxa" w:w="110"/>
-              <w:bottom w:type="dxa" w:w="70"/>
+            <w:tcW w:type="dxa" w:w="500"/>
+            <w:tcMar>
+              <w:top w:type="dxa" w:w="60"/>
+              <w:left w:type="dxa" w:w="110"/>
+              <w:bottom w:type="dxa" w:w="60"/>
+              <w:right w:type="dxa" w:w="110"/>
+            </w:tcMar>
+          </w:tcPr>
+          <w:p>
+            <w:pPr>
+              <w:spacing w:after="0"/>
+            </w:pPr>
+            <w:r>
+              <w:rPr>
+                <w:sz w:val="22"/>
+                <w:szCs w:val="22"/>
+              </w:rPr>
+              <w:t xml:space="preserve"/>
+            </w:r>
+          </w:p>
+        </w:tc>
+        <w:tc>
+          <w:tcPr>
+            <w:tcW w:type="dxa" w:w="4903"/>
+            <w:tcMar>
+              <w:top w:type="dxa" w:w="60"/>
+              <w:left w:type="dxa" w:w="110"/>
+              <w:bottom w:type="dxa" w:w="60"/>
               <w:right w:type="dxa" w:w="110"/>
             </w:tcMar>
           </w:tcPr>
@@ -977,11 +1016,11 @@
         </w:tc>
         <w:tc>
           <w:tcPr>
-            <w:tcW w:type="dxa" w:w="4793"/>
-            <w:tcMar>
-              <w:top w:type="dxa" w:w="70"/>
-              <w:left w:type="dxa" w:w="110"/>
-              <w:bottom w:type="dxa" w:w="70"/>
+            <w:tcW w:type="dxa" w:w="4903"/>
+            <w:tcMar>
+              <w:top w:type="dxa" w:w="60"/>
+              <w:left w:type="dxa" w:w="110"/>
+              <w:bottom w:type="dxa" w:w="60"/>
               <w:right w:type="dxa" w:w="110"/>
             </w:tcMar>
           </w:tcPr>
@@ -1006,15 +1045,15 @@
       </w:tr>
       <w:tr>
         <w:trPr>
-          <w:trHeight w:val="1150" w:hRule="atLeast"/>
+          <w:trHeight w:val="1000" w:hRule="atLeast"/>
         </w:trPr>
         <w:tc>
           <w:tcPr>
-            <w:tcW w:type="dxa" w:w="520"/>
-            <w:tcMar>
-              <w:top w:type="dxa" w:w="70"/>
-              <w:left w:type="dxa" w:w="110"/>
-              <w:bottom w:type="dxa" w:w="70"/>
+            <w:tcW w:type="dxa" w:w="500"/>
+            <w:tcMar>
+              <w:top w:type="dxa" w:w="60"/>
+              <w:left w:type="dxa" w:w="110"/>
+              <w:bottom w:type="dxa" w:w="60"/>
               <w:right w:type="dxa" w:w="110"/>
             </w:tcMar>
           </w:tcPr>
@@ -1037,34 +1076,34 @@
         </w:tc>
         <w:tc>
           <w:tcPr>
-            <w:tcW w:type="dxa" w:w="4793"/>
-            <w:tcMar>
-              <w:top w:type="dxa" w:w="70"/>
-              <w:left w:type="dxa" w:w="110"/>
-              <w:bottom w:type="dxa" w:w="70"/>
-              <w:right w:type="dxa" w:w="110"/>
-            </w:tcMar>
-          </w:tcPr>
-          <w:p>
-            <w:pPr>
-              <w:spacing w:after="0"/>
-            </w:pPr>
-            <w:r>
-              <w:rPr>
-                <w:sz w:val="22"/>
-                <w:szCs w:val="22"/>
-              </w:rPr>
-              <w:t xml:space="preserve"/>
-            </w:r>
-          </w:p>
-        </w:tc>
-        <w:tc>
-          <w:tcPr>
-            <w:tcW w:type="dxa" w:w="4793"/>
-            <w:tcMar>
-              <w:top w:type="dxa" w:w="70"/>
-              <w:left w:type="dxa" w:w="110"/>
-              <w:bottom w:type="dxa" w:w="70"/>
+            <w:tcW w:type="dxa" w:w="4903"/>
+            <w:tcMar>
+              <w:top w:type="dxa" w:w="60"/>
+              <w:left w:type="dxa" w:w="110"/>
+              <w:bottom w:type="dxa" w:w="60"/>
+              <w:right w:type="dxa" w:w="110"/>
+            </w:tcMar>
+          </w:tcPr>
+          <w:p>
+            <w:pPr>
+              <w:spacing w:after="0"/>
+            </w:pPr>
+            <w:r>
+              <w:rPr>
+                <w:sz w:val="22"/>
+                <w:szCs w:val="22"/>
+              </w:rPr>
+              <w:t xml:space="preserve"/>
+            </w:r>
+          </w:p>
+        </w:tc>
+        <w:tc>
+          <w:tcPr>
+            <w:tcW w:type="dxa" w:w="4903"/>
+            <w:tcMar>
+              <w:top w:type="dxa" w:w="60"/>
+              <w:left w:type="dxa" w:w="110"/>
+              <w:bottom w:type="dxa" w:w="60"/>
               <w:right w:type="dxa" w:w="110"/>
             </w:tcMar>
           </w:tcPr>
@@ -1084,15 +1123,15 @@
       </w:tr>
       <w:tr>
         <w:trPr>
-          <w:trHeight w:val="1150" w:hRule="atLeast"/>
+          <w:trHeight w:val="1000" w:hRule="atLeast"/>
         </w:trPr>
         <w:tc>
           <w:tcPr>
-            <w:tcW w:type="dxa" w:w="520"/>
-            <w:tcMar>
-              <w:top w:type="dxa" w:w="70"/>
-              <w:left w:type="dxa" w:w="110"/>
-              <w:bottom w:type="dxa" w:w="70"/>
+            <w:tcW w:type="dxa" w:w="500"/>
+            <w:tcMar>
+              <w:top w:type="dxa" w:w="60"/>
+              <w:left w:type="dxa" w:w="110"/>
+              <w:bottom w:type="dxa" w:w="60"/>
               <w:right w:type="dxa" w:w="110"/>
             </w:tcMar>
           </w:tcPr>
@@ -1115,34 +1154,34 @@
         </w:tc>
         <w:tc>
           <w:tcPr>
-            <w:tcW w:type="dxa" w:w="4793"/>
-            <w:tcMar>
-              <w:top w:type="dxa" w:w="70"/>
-              <w:left w:type="dxa" w:w="110"/>
-              <w:bottom w:type="dxa" w:w="70"/>
-              <w:right w:type="dxa" w:w="110"/>
-            </w:tcMar>
-          </w:tcPr>
-          <w:p>
-            <w:pPr>
-              <w:spacing w:after="0"/>
-            </w:pPr>
-            <w:r>
-              <w:rPr>
-                <w:sz w:val="22"/>
-                <w:szCs w:val="22"/>
-              </w:rPr>
-              <w:t xml:space="preserve"/>
-            </w:r>
-          </w:p>
-        </w:tc>
-        <w:tc>
-          <w:tcPr>
-            <w:tcW w:type="dxa" w:w="4793"/>
-            <w:tcMar>
-              <w:top w:type="dxa" w:w="70"/>
-              <w:left w:type="dxa" w:w="110"/>
-              <w:bottom w:type="dxa" w:w="70"/>
+            <w:tcW w:type="dxa" w:w="4903"/>
+            <w:tcMar>
+              <w:top w:type="dxa" w:w="60"/>
+              <w:left w:type="dxa" w:w="110"/>
+              <w:bottom w:type="dxa" w:w="60"/>
+              <w:right w:type="dxa" w:w="110"/>
+            </w:tcMar>
+          </w:tcPr>
+          <w:p>
+            <w:pPr>
+              <w:spacing w:after="0"/>
+            </w:pPr>
+            <w:r>
+              <w:rPr>
+                <w:sz w:val="22"/>
+                <w:szCs w:val="22"/>
+              </w:rPr>
+              <w:t xml:space="preserve"/>
+            </w:r>
+          </w:p>
+        </w:tc>
+        <w:tc>
+          <w:tcPr>
+            <w:tcW w:type="dxa" w:w="4903"/>
+            <w:tcMar>
+              <w:top w:type="dxa" w:w="60"/>
+              <w:left w:type="dxa" w:w="110"/>
+              <w:bottom w:type="dxa" w:w="60"/>
               <w:right w:type="dxa" w:w="110"/>
             </w:tcMar>
           </w:tcPr>
@@ -1162,15 +1201,15 @@
       </w:tr>
       <w:tr>
         <w:trPr>
-          <w:trHeight w:val="1150" w:hRule="atLeast"/>
+          <w:trHeight w:val="1000" w:hRule="atLeast"/>
         </w:trPr>
         <w:tc>
           <w:tcPr>
-            <w:tcW w:type="dxa" w:w="520"/>
-            <w:tcMar>
-              <w:top w:type="dxa" w:w="70"/>
-              <w:left w:type="dxa" w:w="110"/>
-              <w:bottom w:type="dxa" w:w="70"/>
+            <w:tcW w:type="dxa" w:w="500"/>
+            <w:tcMar>
+              <w:top w:type="dxa" w:w="60"/>
+              <w:left w:type="dxa" w:w="110"/>
+              <w:bottom w:type="dxa" w:w="60"/>
               <w:right w:type="dxa" w:w="110"/>
             </w:tcMar>
           </w:tcPr>
@@ -1193,34 +1232,34 @@
         </w:tc>
         <w:tc>
           <w:tcPr>
-            <w:tcW w:type="dxa" w:w="4793"/>
-            <w:tcMar>
-              <w:top w:type="dxa" w:w="70"/>
-              <w:left w:type="dxa" w:w="110"/>
-              <w:bottom w:type="dxa" w:w="70"/>
-              <w:right w:type="dxa" w:w="110"/>
-            </w:tcMar>
-          </w:tcPr>
-          <w:p>
-            <w:pPr>
-              <w:spacing w:after="0"/>
-            </w:pPr>
-            <w:r>
-              <w:rPr>
-                <w:sz w:val="22"/>
-                <w:szCs w:val="22"/>
-              </w:rPr>
-              <w:t xml:space="preserve"/>
-            </w:r>
-          </w:p>
-        </w:tc>
-        <w:tc>
-          <w:tcPr>
-            <w:tcW w:type="dxa" w:w="4793"/>
-            <w:tcMar>
-              <w:top w:type="dxa" w:w="70"/>
-              <w:left w:type="dxa" w:w="110"/>
-              <w:bottom w:type="dxa" w:w="70"/>
+            <w:tcW w:type="dxa" w:w="4903"/>
+            <w:tcMar>
+              <w:top w:type="dxa" w:w="60"/>
+              <w:left w:type="dxa" w:w="110"/>
+              <w:bottom w:type="dxa" w:w="60"/>
+              <w:right w:type="dxa" w:w="110"/>
+            </w:tcMar>
+          </w:tcPr>
+          <w:p>
+            <w:pPr>
+              <w:spacing w:after="0"/>
+            </w:pPr>
+            <w:r>
+              <w:rPr>
+                <w:sz w:val="22"/>
+                <w:szCs w:val="22"/>
+              </w:rPr>
+              <w:t xml:space="preserve"/>
+            </w:r>
+          </w:p>
+        </w:tc>
+        <w:tc>
+          <w:tcPr>
+            <w:tcW w:type="dxa" w:w="4903"/>
+            <w:tcMar>
+              <w:top w:type="dxa" w:w="60"/>
+              <w:left w:type="dxa" w:w="110"/>
+              <w:bottom w:type="dxa" w:w="60"/>
               <w:right w:type="dxa" w:w="110"/>
             </w:tcMar>
           </w:tcPr>
@@ -1241,39 +1280,42 @@
     </w:tbl>
     <w:p>
       <w:pPr>
-        <w:spacing w:after="180"/>
+        <w:spacing w:after="140"/>
       </w:pPr>
     </w:p>
     <w:p>
+      <w:pPr>
+        <w:spacing w:after="0"/>
+      </w:pPr>
       <w:r>
         <w:br w:type="page"/>
       </w:r>
     </w:p>
     <w:tbl>
       <w:tblPr>
-        <w:tblW w:type="dxa" w:w="10106"/>
+        <w:tblW w:type="dxa" w:w="10306"/>
         <w:tblBorders>
-          <w:top w:val="single" w:color="1D3C34" w:sz="8"/>
-          <w:left w:val="single" w:color="1D3C34" w:sz="8"/>
-          <w:bottom w:val="single" w:color="1D3C34" w:sz="8"/>
-          <w:right w:val="single" w:color="1D3C34" w:sz="8"/>
+          <w:top w:val="single" w:color="1F5C33" w:sz="8"/>
+          <w:left w:val="single" w:color="1F5C33" w:sz="8"/>
+          <w:bottom w:val="single" w:color="1F5C33" w:sz="8"/>
+          <w:right w:val="single" w:color="1F5C33" w:sz="8"/>
           <w:insideH w:val="single" w:color="auto" w:sz="4"/>
           <w:insideV w:val="single" w:color="auto" w:sz="4"/>
         </w:tblBorders>
       </w:tblPr>
       <w:tblGrid>
-        <w:gridCol w:w="10106"/>
+        <w:gridCol w:w="10306"/>
       </w:tblGrid>
       <w:tr>
         <w:tc>
           <w:tcPr>
-            <w:tcW w:type="dxa" w:w="10106"/>
-            <w:shd w:fill="FBF7EE" w:color="auto" w:val="clear"/>
-            <w:tcMar>
-              <w:top w:type="dxa" w:w="130"/>
-              <w:left w:type="dxa" w:w="180"/>
-              <w:bottom w:type="dxa" w:w="130"/>
-              <w:right w:type="dxa" w:w="180"/>
+            <w:tcW w:type="dxa" w:w="10306"/>
+            <w:shd w:fill="DFF0E2" w:color="auto" w:val="clear"/>
+            <w:tcMar>
+              <w:top w:type="dxa" w:w="110"/>
+              <w:left w:type="dxa" w:w="170"/>
+              <w:bottom w:type="dxa" w:w="110"/>
+              <w:right w:type="dxa" w:w="170"/>
             </w:tcMar>
           </w:tcPr>
           <w:p>
@@ -1294,11 +1336,11 @@
             <w:r>
               <w:rPr>
                 <w:rFonts w:ascii="Georgia" w:cs="Georgia" w:eastAsia="Georgia" w:hAnsi="Georgia"/>
-                <w:color w:val="1E211F"/>
+                <w:color w:val="1F5C33"/>
                 <w:sz w:val="23"/>
                 <w:szCs w:val="23"/>
               </w:rPr>
-              <w:t xml:space="preserve">Loneliness in The Bone Sparrow does not need a fence.</w:t>
+              <w:t xml:space="preserve">How does Fraillon make the reader care about Subhi?</w:t>
             </w:r>
           </w:p>
         </w:tc>
@@ -1306,7 +1348,7 @@
     </w:tbl>
     <w:tbl>
       <w:tblPr>
-        <w:tblW w:type="dxa" w:w="10106"/>
+        <w:tblW w:type="dxa" w:w="10306"/>
         <w:tblBorders>
           <w:top w:val="single" w:color="C9BFAE" w:sz="6"/>
           <w:left w:val="single" w:color="C9BFAE" w:sz="6"/>
@@ -1317,45 +1359,44 @@
         </w:tblBorders>
       </w:tblPr>
       <w:tblGrid>
-        <w:gridCol w:w="520"/>
-        <w:gridCol w:w="4793"/>
-        <w:gridCol w:w="4793"/>
+        <w:gridCol w:w="500"/>
+        <w:gridCol w:w="4903"/>
+        <w:gridCol w:w="4903"/>
       </w:tblGrid>
       <w:tr>
         <w:trPr>
-          <w:tblHeader/>
-          <w:trHeight w:val="340" w:hRule="atLeast"/>
+          <w:trHeight w:val="320" w:hRule="atLeast"/>
         </w:trPr>
         <w:tc>
           <w:tcPr>
-            <w:tcW w:type="dxa" w:w="520"/>
-            <w:tcMar>
-              <w:top w:type="dxa" w:w="70"/>
-              <w:left w:type="dxa" w:w="110"/>
-              <w:bottom w:type="dxa" w:w="70"/>
-              <w:right w:type="dxa" w:w="110"/>
-            </w:tcMar>
-          </w:tcPr>
-          <w:p>
-            <w:pPr>
-              <w:spacing w:after="0"/>
-            </w:pPr>
-            <w:r>
-              <w:rPr>
-                <w:sz w:val="22"/>
-                <w:szCs w:val="22"/>
-              </w:rPr>
-              <w:t xml:space="preserve"/>
-            </w:r>
-          </w:p>
-        </w:tc>
-        <w:tc>
-          <w:tcPr>
-            <w:tcW w:type="dxa" w:w="4793"/>
-            <w:tcMar>
-              <w:top w:type="dxa" w:w="70"/>
-              <w:left w:type="dxa" w:w="110"/>
-              <w:bottom w:type="dxa" w:w="70"/>
+            <w:tcW w:type="dxa" w:w="500"/>
+            <w:tcMar>
+              <w:top w:type="dxa" w:w="60"/>
+              <w:left w:type="dxa" w:w="110"/>
+              <w:bottom w:type="dxa" w:w="60"/>
+              <w:right w:type="dxa" w:w="110"/>
+            </w:tcMar>
+          </w:tcPr>
+          <w:p>
+            <w:pPr>
+              <w:spacing w:after="0"/>
+            </w:pPr>
+            <w:r>
+              <w:rPr>
+                <w:sz w:val="22"/>
+                <w:szCs w:val="22"/>
+              </w:rPr>
+              <w:t xml:space="preserve"/>
+            </w:r>
+          </w:p>
+        </w:tc>
+        <w:tc>
+          <w:tcPr>
+            <w:tcW w:type="dxa" w:w="4903"/>
+            <w:tcMar>
+              <w:top w:type="dxa" w:w="60"/>
+              <w:left w:type="dxa" w:w="110"/>
+              <w:bottom w:type="dxa" w:w="60"/>
               <w:right w:type="dxa" w:w="110"/>
             </w:tcMar>
           </w:tcPr>
@@ -1379,11 +1420,11 @@
         </w:tc>
         <w:tc>
           <w:tcPr>
-            <w:tcW w:type="dxa" w:w="4793"/>
-            <w:tcMar>
-              <w:top w:type="dxa" w:w="70"/>
-              <w:left w:type="dxa" w:w="110"/>
-              <w:bottom w:type="dxa" w:w="70"/>
+            <w:tcW w:type="dxa" w:w="4903"/>
+            <w:tcMar>
+              <w:top w:type="dxa" w:w="60"/>
+              <w:left w:type="dxa" w:w="110"/>
+              <w:bottom w:type="dxa" w:w="60"/>
               <w:right w:type="dxa" w:w="110"/>
             </w:tcMar>
           </w:tcPr>
@@ -1408,15 +1449,15 @@
       </w:tr>
       <w:tr>
         <w:trPr>
-          <w:trHeight w:val="1150" w:hRule="atLeast"/>
+          <w:trHeight w:val="1000" w:hRule="atLeast"/>
         </w:trPr>
         <w:tc>
           <w:tcPr>
-            <w:tcW w:type="dxa" w:w="520"/>
-            <w:tcMar>
-              <w:top w:type="dxa" w:w="70"/>
-              <w:left w:type="dxa" w:w="110"/>
-              <w:bottom w:type="dxa" w:w="70"/>
+            <w:tcW w:type="dxa" w:w="500"/>
+            <w:tcMar>
+              <w:top w:type="dxa" w:w="60"/>
+              <w:left w:type="dxa" w:w="110"/>
+              <w:bottom w:type="dxa" w:w="60"/>
               <w:right w:type="dxa" w:w="110"/>
             </w:tcMar>
           </w:tcPr>
@@ -1439,34 +1480,34 @@
         </w:tc>
         <w:tc>
           <w:tcPr>
-            <w:tcW w:type="dxa" w:w="4793"/>
-            <w:tcMar>
-              <w:top w:type="dxa" w:w="70"/>
-              <w:left w:type="dxa" w:w="110"/>
-              <w:bottom w:type="dxa" w:w="70"/>
-              <w:right w:type="dxa" w:w="110"/>
-            </w:tcMar>
-          </w:tcPr>
-          <w:p>
-            <w:pPr>
-              <w:spacing w:after="0"/>
-            </w:pPr>
-            <w:r>
-              <w:rPr>
-                <w:sz w:val="22"/>
-                <w:szCs w:val="22"/>
-              </w:rPr>
-              <w:t xml:space="preserve"/>
-            </w:r>
-          </w:p>
-        </w:tc>
-        <w:tc>
-          <w:tcPr>
-            <w:tcW w:type="dxa" w:w="4793"/>
-            <w:tcMar>
-              <w:top w:type="dxa" w:w="70"/>
-              <w:left w:type="dxa" w:w="110"/>
-              <w:bottom w:type="dxa" w:w="70"/>
+            <w:tcW w:type="dxa" w:w="4903"/>
+            <w:tcMar>
+              <w:top w:type="dxa" w:w="60"/>
+              <w:left w:type="dxa" w:w="110"/>
+              <w:bottom w:type="dxa" w:w="60"/>
+              <w:right w:type="dxa" w:w="110"/>
+            </w:tcMar>
+          </w:tcPr>
+          <w:p>
+            <w:pPr>
+              <w:spacing w:after="0"/>
+            </w:pPr>
+            <w:r>
+              <w:rPr>
+                <w:sz w:val="22"/>
+                <w:szCs w:val="22"/>
+              </w:rPr>
+              <w:t xml:space="preserve"/>
+            </w:r>
+          </w:p>
+        </w:tc>
+        <w:tc>
+          <w:tcPr>
+            <w:tcW w:type="dxa" w:w="4903"/>
+            <w:tcMar>
+              <w:top w:type="dxa" w:w="60"/>
+              <w:left w:type="dxa" w:w="110"/>
+              <w:bottom w:type="dxa" w:w="60"/>
               <w:right w:type="dxa" w:w="110"/>
             </w:tcMar>
           </w:tcPr>
@@ -1486,15 +1527,15 @@
       </w:tr>
       <w:tr>
         <w:trPr>
-          <w:trHeight w:val="1150" w:hRule="atLeast"/>
+          <w:trHeight w:val="1000" w:hRule="atLeast"/>
         </w:trPr>
         <w:tc>
           <w:tcPr>
-            <w:tcW w:type="dxa" w:w="520"/>
-            <w:tcMar>
-              <w:top w:type="dxa" w:w="70"/>
-              <w:left w:type="dxa" w:w="110"/>
-              <w:bottom w:type="dxa" w:w="70"/>
+            <w:tcW w:type="dxa" w:w="500"/>
+            <w:tcMar>
+              <w:top w:type="dxa" w:w="60"/>
+              <w:left w:type="dxa" w:w="110"/>
+              <w:bottom w:type="dxa" w:w="60"/>
               <w:right w:type="dxa" w:w="110"/>
             </w:tcMar>
           </w:tcPr>
@@ -1517,34 +1558,34 @@
         </w:tc>
         <w:tc>
           <w:tcPr>
-            <w:tcW w:type="dxa" w:w="4793"/>
-            <w:tcMar>
-              <w:top w:type="dxa" w:w="70"/>
-              <w:left w:type="dxa" w:w="110"/>
-              <w:bottom w:type="dxa" w:w="70"/>
-              <w:right w:type="dxa" w:w="110"/>
-            </w:tcMar>
-          </w:tcPr>
-          <w:p>
-            <w:pPr>
-              <w:spacing w:after="0"/>
-            </w:pPr>
-            <w:r>
-              <w:rPr>
-                <w:sz w:val="22"/>
-                <w:szCs w:val="22"/>
-              </w:rPr>
-              <w:t xml:space="preserve"/>
-            </w:r>
-          </w:p>
-        </w:tc>
-        <w:tc>
-          <w:tcPr>
-            <w:tcW w:type="dxa" w:w="4793"/>
-            <w:tcMar>
-              <w:top w:type="dxa" w:w="70"/>
-              <w:left w:type="dxa" w:w="110"/>
-              <w:bottom w:type="dxa" w:w="70"/>
+            <w:tcW w:type="dxa" w:w="4903"/>
+            <w:tcMar>
+              <w:top w:type="dxa" w:w="60"/>
+              <w:left w:type="dxa" w:w="110"/>
+              <w:bottom w:type="dxa" w:w="60"/>
+              <w:right w:type="dxa" w:w="110"/>
+            </w:tcMar>
+          </w:tcPr>
+          <w:p>
+            <w:pPr>
+              <w:spacing w:after="0"/>
+            </w:pPr>
+            <w:r>
+              <w:rPr>
+                <w:sz w:val="22"/>
+                <w:szCs w:val="22"/>
+              </w:rPr>
+              <w:t xml:space="preserve"/>
+            </w:r>
+          </w:p>
+        </w:tc>
+        <w:tc>
+          <w:tcPr>
+            <w:tcW w:type="dxa" w:w="4903"/>
+            <w:tcMar>
+              <w:top w:type="dxa" w:w="60"/>
+              <w:left w:type="dxa" w:w="110"/>
+              <w:bottom w:type="dxa" w:w="60"/>
               <w:right w:type="dxa" w:w="110"/>
             </w:tcMar>
           </w:tcPr>
@@ -1564,15 +1605,15 @@
       </w:tr>
       <w:tr>
         <w:trPr>
-          <w:trHeight w:val="1150" w:hRule="atLeast"/>
+          <w:trHeight w:val="1000" w:hRule="atLeast"/>
         </w:trPr>
         <w:tc>
           <w:tcPr>
-            <w:tcW w:type="dxa" w:w="520"/>
-            <w:tcMar>
-              <w:top w:type="dxa" w:w="70"/>
-              <w:left w:type="dxa" w:w="110"/>
-              <w:bottom w:type="dxa" w:w="70"/>
+            <w:tcW w:type="dxa" w:w="500"/>
+            <w:tcMar>
+              <w:top w:type="dxa" w:w="60"/>
+              <w:left w:type="dxa" w:w="110"/>
+              <w:bottom w:type="dxa" w:w="60"/>
               <w:right w:type="dxa" w:w="110"/>
             </w:tcMar>
           </w:tcPr>
@@ -1595,34 +1636,34 @@
         </w:tc>
         <w:tc>
           <w:tcPr>
-            <w:tcW w:type="dxa" w:w="4793"/>
-            <w:tcMar>
-              <w:top w:type="dxa" w:w="70"/>
-              <w:left w:type="dxa" w:w="110"/>
-              <w:bottom w:type="dxa" w:w="70"/>
-              <w:right w:type="dxa" w:w="110"/>
-            </w:tcMar>
-          </w:tcPr>
-          <w:p>
-            <w:pPr>
-              <w:spacing w:after="0"/>
-            </w:pPr>
-            <w:r>
-              <w:rPr>
-                <w:sz w:val="22"/>
-                <w:szCs w:val="22"/>
-              </w:rPr>
-              <w:t xml:space="preserve"/>
-            </w:r>
-          </w:p>
-        </w:tc>
-        <w:tc>
-          <w:tcPr>
-            <w:tcW w:type="dxa" w:w="4793"/>
-            <w:tcMar>
-              <w:top w:type="dxa" w:w="70"/>
-              <w:left w:type="dxa" w:w="110"/>
-              <w:bottom w:type="dxa" w:w="70"/>
+            <w:tcW w:type="dxa" w:w="4903"/>
+            <w:tcMar>
+              <w:top w:type="dxa" w:w="60"/>
+              <w:left w:type="dxa" w:w="110"/>
+              <w:bottom w:type="dxa" w:w="60"/>
+              <w:right w:type="dxa" w:w="110"/>
+            </w:tcMar>
+          </w:tcPr>
+          <w:p>
+            <w:pPr>
+              <w:spacing w:after="0"/>
+            </w:pPr>
+            <w:r>
+              <w:rPr>
+                <w:sz w:val="22"/>
+                <w:szCs w:val="22"/>
+              </w:rPr>
+              <w:t xml:space="preserve"/>
+            </w:r>
+          </w:p>
+        </w:tc>
+        <w:tc>
+          <w:tcPr>
+            <w:tcW w:type="dxa" w:w="4903"/>
+            <w:tcMar>
+              <w:top w:type="dxa" w:w="60"/>
+              <w:left w:type="dxa" w:w="110"/>
+              <w:bottom w:type="dxa" w:w="60"/>
               <w:right w:type="dxa" w:w="110"/>
             </w:tcMar>
           </w:tcPr>
@@ -1643,34 +1684,34 @@
     </w:tbl>
     <w:p>
       <w:pPr>
-        <w:spacing w:after="180"/>
+        <w:spacing w:after="140"/>
       </w:pPr>
     </w:p>
     <w:tbl>
       <w:tblPr>
-        <w:tblW w:type="dxa" w:w="10106"/>
+        <w:tblW w:type="dxa" w:w="10306"/>
         <w:tblBorders>
-          <w:top w:val="single" w:color="1D3C34" w:sz="8"/>
-          <w:left w:val="single" w:color="1D3C34" w:sz="8"/>
-          <w:bottom w:val="single" w:color="1D3C34" w:sz="8"/>
-          <w:right w:val="single" w:color="1D3C34" w:sz="8"/>
+          <w:top w:val="single" w:color="0B447C" w:sz="8"/>
+          <w:left w:val="single" w:color="0B447C" w:sz="8"/>
+          <w:bottom w:val="single" w:color="0B447C" w:sz="8"/>
+          <w:right w:val="single" w:color="0B447C" w:sz="8"/>
           <w:insideH w:val="single" w:color="auto" w:sz="4"/>
           <w:insideV w:val="single" w:color="auto" w:sz="4"/>
         </w:tblBorders>
       </w:tblPr>
       <w:tblGrid>
-        <w:gridCol w:w="10106"/>
+        <w:gridCol w:w="10306"/>
       </w:tblGrid>
       <w:tr>
         <w:tc>
           <w:tcPr>
-            <w:tcW w:type="dxa" w:w="10106"/>
-            <w:shd w:fill="FBF7EE" w:color="auto" w:val="clear"/>
-            <w:tcMar>
-              <w:top w:type="dxa" w:w="130"/>
-              <w:left w:type="dxa" w:w="180"/>
-              <w:bottom w:type="dxa" w:w="130"/>
-              <w:right w:type="dxa" w:w="180"/>
+            <w:tcW w:type="dxa" w:w="10306"/>
+            <w:shd w:fill="D6EAFC" w:color="auto" w:val="clear"/>
+            <w:tcMar>
+              <w:top w:type="dxa" w:w="110"/>
+              <w:left w:type="dxa" w:w="170"/>
+              <w:bottom w:type="dxa" w:w="110"/>
+              <w:right w:type="dxa" w:w="170"/>
             </w:tcMar>
           </w:tcPr>
           <w:p>
@@ -1691,11 +1732,11 @@
             <w:r>
               <w:rPr>
                 <w:rFonts w:ascii="Georgia" w:cs="Georgia" w:eastAsia="Georgia" w:hAnsi="Georgia"/>
-                <w:color w:val="1E211F"/>
+                <w:color w:val="0B447C"/>
                 <w:sz w:val="23"/>
                 <w:szCs w:val="23"/>
               </w:rPr>
-              <w:t xml:space="preserve">In the camp, the smallest things matter most.</w:t>
+              <w:t xml:space="preserve">How is hope shown in The Bone Sparrow?</w:t>
             </w:r>
           </w:p>
         </w:tc>
@@ -1703,7 +1744,7 @@
     </w:tbl>
     <w:tbl>
       <w:tblPr>
-        <w:tblW w:type="dxa" w:w="10106"/>
+        <w:tblW w:type="dxa" w:w="10306"/>
         <w:tblBorders>
           <w:top w:val="single" w:color="C9BFAE" w:sz="6"/>
           <w:left w:val="single" w:color="C9BFAE" w:sz="6"/>
@@ -1714,45 +1755,44 @@
         </w:tblBorders>
       </w:tblPr>
       <w:tblGrid>
-        <w:gridCol w:w="520"/>
-        <w:gridCol w:w="4793"/>
-        <w:gridCol w:w="4793"/>
+        <w:gridCol w:w="500"/>
+        <w:gridCol w:w="4903"/>
+        <w:gridCol w:w="4903"/>
       </w:tblGrid>
       <w:tr>
         <w:trPr>
-          <w:tblHeader/>
-          <w:trHeight w:val="340" w:hRule="atLeast"/>
+          <w:trHeight w:val="320" w:hRule="atLeast"/>
         </w:trPr>
         <w:tc>
           <w:tcPr>
-            <w:tcW w:type="dxa" w:w="520"/>
-            <w:tcMar>
-              <w:top w:type="dxa" w:w="70"/>
-              <w:left w:type="dxa" w:w="110"/>
-              <w:bottom w:type="dxa" w:w="70"/>
-              <w:right w:type="dxa" w:w="110"/>
-            </w:tcMar>
-          </w:tcPr>
-          <w:p>
-            <w:pPr>
-              <w:spacing w:after="0"/>
-            </w:pPr>
-            <w:r>
-              <w:rPr>
-                <w:sz w:val="22"/>
-                <w:szCs w:val="22"/>
-              </w:rPr>
-              <w:t xml:space="preserve"/>
-            </w:r>
-          </w:p>
-        </w:tc>
-        <w:tc>
-          <w:tcPr>
-            <w:tcW w:type="dxa" w:w="4793"/>
-            <w:tcMar>
-              <w:top w:type="dxa" w:w="70"/>
-              <w:left w:type="dxa" w:w="110"/>
-              <w:bottom w:type="dxa" w:w="70"/>
+            <w:tcW w:type="dxa" w:w="500"/>
+            <w:tcMar>
+              <w:top w:type="dxa" w:w="60"/>
+              <w:left w:type="dxa" w:w="110"/>
+              <w:bottom w:type="dxa" w:w="60"/>
+              <w:right w:type="dxa" w:w="110"/>
+            </w:tcMar>
+          </w:tcPr>
+          <w:p>
+            <w:pPr>
+              <w:spacing w:after="0"/>
+            </w:pPr>
+            <w:r>
+              <w:rPr>
+                <w:sz w:val="22"/>
+                <w:szCs w:val="22"/>
+              </w:rPr>
+              <w:t xml:space="preserve"/>
+            </w:r>
+          </w:p>
+        </w:tc>
+        <w:tc>
+          <w:tcPr>
+            <w:tcW w:type="dxa" w:w="4903"/>
+            <w:tcMar>
+              <w:top w:type="dxa" w:w="60"/>
+              <w:left w:type="dxa" w:w="110"/>
+              <w:bottom w:type="dxa" w:w="60"/>
               <w:right w:type="dxa" w:w="110"/>
             </w:tcMar>
           </w:tcPr>
@@ -1776,11 +1816,11 @@
         </w:tc>
         <w:tc>
           <w:tcPr>
-            <w:tcW w:type="dxa" w:w="4793"/>
-            <w:tcMar>
-              <w:top w:type="dxa" w:w="70"/>
-              <w:left w:type="dxa" w:w="110"/>
-              <w:bottom w:type="dxa" w:w="70"/>
+            <w:tcW w:type="dxa" w:w="4903"/>
+            <w:tcMar>
+              <w:top w:type="dxa" w:w="60"/>
+              <w:left w:type="dxa" w:w="110"/>
+              <w:bottom w:type="dxa" w:w="60"/>
               <w:right w:type="dxa" w:w="110"/>
             </w:tcMar>
           </w:tcPr>
@@ -1805,15 +1845,15 @@
       </w:tr>
       <w:tr>
         <w:trPr>
-          <w:trHeight w:val="1150" w:hRule="atLeast"/>
+          <w:trHeight w:val="1000" w:hRule="atLeast"/>
         </w:trPr>
         <w:tc>
           <w:tcPr>
-            <w:tcW w:type="dxa" w:w="520"/>
-            <w:tcMar>
-              <w:top w:type="dxa" w:w="70"/>
-              <w:left w:type="dxa" w:w="110"/>
-              <w:bottom w:type="dxa" w:w="70"/>
+            <w:tcW w:type="dxa" w:w="500"/>
+            <w:tcMar>
+              <w:top w:type="dxa" w:w="60"/>
+              <w:left w:type="dxa" w:w="110"/>
+              <w:bottom w:type="dxa" w:w="60"/>
               <w:right w:type="dxa" w:w="110"/>
             </w:tcMar>
           </w:tcPr>
@@ -1836,34 +1876,34 @@
         </w:tc>
         <w:tc>
           <w:tcPr>
-            <w:tcW w:type="dxa" w:w="4793"/>
-            <w:tcMar>
-              <w:top w:type="dxa" w:w="70"/>
-              <w:left w:type="dxa" w:w="110"/>
-              <w:bottom w:type="dxa" w:w="70"/>
-              <w:right w:type="dxa" w:w="110"/>
-            </w:tcMar>
-          </w:tcPr>
-          <w:p>
-            <w:pPr>
-              <w:spacing w:after="0"/>
-            </w:pPr>
-            <w:r>
-              <w:rPr>
-                <w:sz w:val="22"/>
-                <w:szCs w:val="22"/>
-              </w:rPr>
-              <w:t xml:space="preserve"/>
-            </w:r>
-          </w:p>
-        </w:tc>
-        <w:tc>
-          <w:tcPr>
-            <w:tcW w:type="dxa" w:w="4793"/>
-            <w:tcMar>
-              <w:top w:type="dxa" w:w="70"/>
-              <w:left w:type="dxa" w:w="110"/>
-              <w:bottom w:type="dxa" w:w="70"/>
+            <w:tcW w:type="dxa" w:w="4903"/>
+            <w:tcMar>
+              <w:top w:type="dxa" w:w="60"/>
+              <w:left w:type="dxa" w:w="110"/>
+              <w:bottom w:type="dxa" w:w="60"/>
+              <w:right w:type="dxa" w:w="110"/>
+            </w:tcMar>
+          </w:tcPr>
+          <w:p>
+            <w:pPr>
+              <w:spacing w:after="0"/>
+            </w:pPr>
+            <w:r>
+              <w:rPr>
+                <w:sz w:val="22"/>
+                <w:szCs w:val="22"/>
+              </w:rPr>
+              <w:t xml:space="preserve"/>
+            </w:r>
+          </w:p>
+        </w:tc>
+        <w:tc>
+          <w:tcPr>
+            <w:tcW w:type="dxa" w:w="4903"/>
+            <w:tcMar>
+              <w:top w:type="dxa" w:w="60"/>
+              <w:left w:type="dxa" w:w="110"/>
+              <w:bottom w:type="dxa" w:w="60"/>
               <w:right w:type="dxa" w:w="110"/>
             </w:tcMar>
           </w:tcPr>
@@ -1883,15 +1923,15 @@
       </w:tr>
       <w:tr>
         <w:trPr>
-          <w:trHeight w:val="1150" w:hRule="atLeast"/>
+          <w:trHeight w:val="1000" w:hRule="atLeast"/>
         </w:trPr>
         <w:tc>
           <w:tcPr>
-            <w:tcW w:type="dxa" w:w="520"/>
-            <w:tcMar>
-              <w:top w:type="dxa" w:w="70"/>
-              <w:left w:type="dxa" w:w="110"/>
-              <w:bottom w:type="dxa" w:w="70"/>
+            <w:tcW w:type="dxa" w:w="500"/>
+            <w:tcMar>
+              <w:top w:type="dxa" w:w="60"/>
+              <w:left w:type="dxa" w:w="110"/>
+              <w:bottom w:type="dxa" w:w="60"/>
               <w:right w:type="dxa" w:w="110"/>
             </w:tcMar>
           </w:tcPr>
@@ -1914,34 +1954,34 @@
         </w:tc>
         <w:tc>
           <w:tcPr>
-            <w:tcW w:type="dxa" w:w="4793"/>
-            <w:tcMar>
-              <w:top w:type="dxa" w:w="70"/>
-              <w:left w:type="dxa" w:w="110"/>
-              <w:bottom w:type="dxa" w:w="70"/>
-              <w:right w:type="dxa" w:w="110"/>
-            </w:tcMar>
-          </w:tcPr>
-          <w:p>
-            <w:pPr>
-              <w:spacing w:after="0"/>
-            </w:pPr>
-            <w:r>
-              <w:rPr>
-                <w:sz w:val="22"/>
-                <w:szCs w:val="22"/>
-              </w:rPr>
-              <w:t xml:space="preserve"/>
-            </w:r>
-          </w:p>
-        </w:tc>
-        <w:tc>
-          <w:tcPr>
-            <w:tcW w:type="dxa" w:w="4793"/>
-            <w:tcMar>
-              <w:top w:type="dxa" w:w="70"/>
-              <w:left w:type="dxa" w:w="110"/>
-              <w:bottom w:type="dxa" w:w="70"/>
+            <w:tcW w:type="dxa" w:w="4903"/>
+            <w:tcMar>
+              <w:top w:type="dxa" w:w="60"/>
+              <w:left w:type="dxa" w:w="110"/>
+              <w:bottom w:type="dxa" w:w="60"/>
+              <w:right w:type="dxa" w:w="110"/>
+            </w:tcMar>
+          </w:tcPr>
+          <w:p>
+            <w:pPr>
+              <w:spacing w:after="0"/>
+            </w:pPr>
+            <w:r>
+              <w:rPr>
+                <w:sz w:val="22"/>
+                <w:szCs w:val="22"/>
+              </w:rPr>
+              <w:t xml:space="preserve"/>
+            </w:r>
+          </w:p>
+        </w:tc>
+        <w:tc>
+          <w:tcPr>
+            <w:tcW w:type="dxa" w:w="4903"/>
+            <w:tcMar>
+              <w:top w:type="dxa" w:w="60"/>
+              <w:left w:type="dxa" w:w="110"/>
+              <w:bottom w:type="dxa" w:w="60"/>
               <w:right w:type="dxa" w:w="110"/>
             </w:tcMar>
           </w:tcPr>
@@ -1961,15 +2001,15 @@
       </w:tr>
       <w:tr>
         <w:trPr>
-          <w:trHeight w:val="1150" w:hRule="atLeast"/>
+          <w:trHeight w:val="1000" w:hRule="atLeast"/>
         </w:trPr>
         <w:tc>
           <w:tcPr>
-            <w:tcW w:type="dxa" w:w="520"/>
-            <w:tcMar>
-              <w:top w:type="dxa" w:w="70"/>
-              <w:left w:type="dxa" w:w="110"/>
-              <w:bottom w:type="dxa" w:w="70"/>
+            <w:tcW w:type="dxa" w:w="500"/>
+            <w:tcMar>
+              <w:top w:type="dxa" w:w="60"/>
+              <w:left w:type="dxa" w:w="110"/>
+              <w:bottom w:type="dxa" w:w="60"/>
               <w:right w:type="dxa" w:w="110"/>
             </w:tcMar>
           </w:tcPr>
@@ -1992,34 +2032,34 @@
         </w:tc>
         <w:tc>
           <w:tcPr>
-            <w:tcW w:type="dxa" w:w="4793"/>
-            <w:tcMar>
-              <w:top w:type="dxa" w:w="70"/>
-              <w:left w:type="dxa" w:w="110"/>
-              <w:bottom w:type="dxa" w:w="70"/>
-              <w:right w:type="dxa" w:w="110"/>
-            </w:tcMar>
-          </w:tcPr>
-          <w:p>
-            <w:pPr>
-              <w:spacing w:after="0"/>
-            </w:pPr>
-            <w:r>
-              <w:rPr>
-                <w:sz w:val="22"/>
-                <w:szCs w:val="22"/>
-              </w:rPr>
-              <w:t xml:space="preserve"/>
-            </w:r>
-          </w:p>
-        </w:tc>
-        <w:tc>
-          <w:tcPr>
-            <w:tcW w:type="dxa" w:w="4793"/>
-            <w:tcMar>
-              <w:top w:type="dxa" w:w="70"/>
-              <w:left w:type="dxa" w:w="110"/>
-              <w:bottom w:type="dxa" w:w="70"/>
+            <w:tcW w:type="dxa" w:w="4903"/>
+            <w:tcMar>
+              <w:top w:type="dxa" w:w="60"/>
+              <w:left w:type="dxa" w:w="110"/>
+              <w:bottom w:type="dxa" w:w="60"/>
+              <w:right w:type="dxa" w:w="110"/>
+            </w:tcMar>
+          </w:tcPr>
+          <w:p>
+            <w:pPr>
+              <w:spacing w:after="0"/>
+            </w:pPr>
+            <w:r>
+              <w:rPr>
+                <w:sz w:val="22"/>
+                <w:szCs w:val="22"/>
+              </w:rPr>
+              <w:t xml:space="preserve"/>
+            </w:r>
+          </w:p>
+        </w:tc>
+        <w:tc>
+          <w:tcPr>
+            <w:tcW w:type="dxa" w:w="4903"/>
+            <w:tcMar>
+              <w:top w:type="dxa" w:w="60"/>
+              <w:left w:type="dxa" w:w="110"/>
+              <w:bottom w:type="dxa" w:w="60"/>
               <w:right w:type="dxa" w:w="110"/>
             </w:tcMar>
           </w:tcPr>
@@ -2040,34 +2080,34 @@
     </w:tbl>
     <w:p>
       <w:pPr>
-        <w:spacing w:after="180"/>
+        <w:spacing w:after="140"/>
       </w:pPr>
     </w:p>
     <w:tbl>
       <w:tblPr>
-        <w:tblW w:type="dxa" w:w="10106"/>
+        <w:tblW w:type="dxa" w:w="10306"/>
         <w:tblBorders>
-          <w:top w:val="single" w:color="1D3C34" w:sz="8"/>
-          <w:left w:val="single" w:color="1D3C34" w:sz="8"/>
-          <w:bottom w:val="single" w:color="1D3C34" w:sz="8"/>
-          <w:right w:val="single" w:color="1D3C34" w:sz="8"/>
+          <w:top w:val="single" w:color="1F5C33" w:sz="8"/>
+          <w:left w:val="single" w:color="1F5C33" w:sz="8"/>
+          <w:bottom w:val="single" w:color="1F5C33" w:sz="8"/>
+          <w:right w:val="single" w:color="1F5C33" w:sz="8"/>
           <w:insideH w:val="single" w:color="auto" w:sz="4"/>
           <w:insideV w:val="single" w:color="auto" w:sz="4"/>
         </w:tblBorders>
       </w:tblPr>
       <w:tblGrid>
-        <w:gridCol w:w="10106"/>
+        <w:gridCol w:w="10306"/>
       </w:tblGrid>
       <w:tr>
         <w:tc>
           <w:tcPr>
-            <w:tcW w:type="dxa" w:w="10106"/>
-            <w:shd w:fill="FBF7EE" w:color="auto" w:val="clear"/>
-            <w:tcMar>
-              <w:top w:type="dxa" w:w="130"/>
-              <w:left w:type="dxa" w:w="180"/>
-              <w:bottom w:type="dxa" w:w="130"/>
-              <w:right w:type="dxa" w:w="180"/>
+            <w:tcW w:type="dxa" w:w="10306"/>
+            <w:shd w:fill="DFF0E2" w:color="auto" w:val="clear"/>
+            <w:tcMar>
+              <w:top w:type="dxa" w:w="110"/>
+              <w:left w:type="dxa" w:w="170"/>
+              <w:bottom w:type="dxa" w:w="110"/>
+              <w:right w:type="dxa" w:w="170"/>
             </w:tcMar>
           </w:tcPr>
           <w:p>
@@ -2088,11 +2128,11 @@
             <w:r>
               <w:rPr>
                 <w:rFonts w:ascii="Georgia" w:cs="Georgia" w:eastAsia="Georgia" w:hAnsi="Georgia"/>
-                <w:color w:val="1E211F"/>
+                <w:color w:val="1F5C33"/>
                 <w:sz w:val="23"/>
                 <w:szCs w:val="23"/>
               </w:rPr>
-              <w:t xml:space="preserve">Fraillon leaves the reader hopeful and uneasy at the same time.</w:t>
+              <w:t xml:space="preserve">How does Fraillon show the reader what life in the camp is like?</w:t>
             </w:r>
           </w:p>
         </w:tc>
@@ -2100,7 +2140,7 @@
     </w:tbl>
     <w:tbl>
       <w:tblPr>
-        <w:tblW w:type="dxa" w:w="10106"/>
+        <w:tblW w:type="dxa" w:w="10306"/>
         <w:tblBorders>
           <w:top w:val="single" w:color="C9BFAE" w:sz="6"/>
           <w:left w:val="single" w:color="C9BFAE" w:sz="6"/>
@@ -2111,45 +2151,44 @@
         </w:tblBorders>
       </w:tblPr>
       <w:tblGrid>
-        <w:gridCol w:w="520"/>
-        <w:gridCol w:w="4793"/>
-        <w:gridCol w:w="4793"/>
+        <w:gridCol w:w="500"/>
+        <w:gridCol w:w="4903"/>
+        <w:gridCol w:w="4903"/>
       </w:tblGrid>
       <w:tr>
         <w:trPr>
-          <w:tblHeader/>
-          <w:trHeight w:val="340" w:hRule="atLeast"/>
+          <w:trHeight w:val="320" w:hRule="atLeast"/>
         </w:trPr>
         <w:tc>
           <w:tcPr>
-            <w:tcW w:type="dxa" w:w="520"/>
-            <w:tcMar>
-              <w:top w:type="dxa" w:w="70"/>
-              <w:left w:type="dxa" w:w="110"/>
-              <w:bottom w:type="dxa" w:w="70"/>
-              <w:right w:type="dxa" w:w="110"/>
-            </w:tcMar>
-          </w:tcPr>
-          <w:p>
-            <w:pPr>
-              <w:spacing w:after="0"/>
-            </w:pPr>
-            <w:r>
-              <w:rPr>
-                <w:sz w:val="22"/>
-                <w:szCs w:val="22"/>
-              </w:rPr>
-              <w:t xml:space="preserve"/>
-            </w:r>
-          </w:p>
-        </w:tc>
-        <w:tc>
-          <w:tcPr>
-            <w:tcW w:type="dxa" w:w="4793"/>
-            <w:tcMar>
-              <w:top w:type="dxa" w:w="70"/>
-              <w:left w:type="dxa" w:w="110"/>
-              <w:bottom w:type="dxa" w:w="70"/>
+            <w:tcW w:type="dxa" w:w="500"/>
+            <w:tcMar>
+              <w:top w:type="dxa" w:w="60"/>
+              <w:left w:type="dxa" w:w="110"/>
+              <w:bottom w:type="dxa" w:w="60"/>
+              <w:right w:type="dxa" w:w="110"/>
+            </w:tcMar>
+          </w:tcPr>
+          <w:p>
+            <w:pPr>
+              <w:spacing w:after="0"/>
+            </w:pPr>
+            <w:r>
+              <w:rPr>
+                <w:sz w:val="22"/>
+                <w:szCs w:val="22"/>
+              </w:rPr>
+              <w:t xml:space="preserve"/>
+            </w:r>
+          </w:p>
+        </w:tc>
+        <w:tc>
+          <w:tcPr>
+            <w:tcW w:type="dxa" w:w="4903"/>
+            <w:tcMar>
+              <w:top w:type="dxa" w:w="60"/>
+              <w:left w:type="dxa" w:w="110"/>
+              <w:bottom w:type="dxa" w:w="60"/>
               <w:right w:type="dxa" w:w="110"/>
             </w:tcMar>
           </w:tcPr>
@@ -2173,11 +2212,11 @@
         </w:tc>
         <w:tc>
           <w:tcPr>
-            <w:tcW w:type="dxa" w:w="4793"/>
-            <w:tcMar>
-              <w:top w:type="dxa" w:w="70"/>
-              <w:left w:type="dxa" w:w="110"/>
-              <w:bottom w:type="dxa" w:w="70"/>
+            <w:tcW w:type="dxa" w:w="4903"/>
+            <w:tcMar>
+              <w:top w:type="dxa" w:w="60"/>
+              <w:left w:type="dxa" w:w="110"/>
+              <w:bottom w:type="dxa" w:w="60"/>
               <w:right w:type="dxa" w:w="110"/>
             </w:tcMar>
           </w:tcPr>
@@ -2202,15 +2241,15 @@
       </w:tr>
       <w:tr>
         <w:trPr>
-          <w:trHeight w:val="1150" w:hRule="atLeast"/>
+          <w:trHeight w:val="1000" w:hRule="atLeast"/>
         </w:trPr>
         <w:tc>
           <w:tcPr>
-            <w:tcW w:type="dxa" w:w="520"/>
-            <w:tcMar>
-              <w:top w:type="dxa" w:w="70"/>
-              <w:left w:type="dxa" w:w="110"/>
-              <w:bottom w:type="dxa" w:w="70"/>
+            <w:tcW w:type="dxa" w:w="500"/>
+            <w:tcMar>
+              <w:top w:type="dxa" w:w="60"/>
+              <w:left w:type="dxa" w:w="110"/>
+              <w:bottom w:type="dxa" w:w="60"/>
               <w:right w:type="dxa" w:w="110"/>
             </w:tcMar>
           </w:tcPr>
@@ -2233,34 +2272,34 @@
         </w:tc>
         <w:tc>
           <w:tcPr>
-            <w:tcW w:type="dxa" w:w="4793"/>
-            <w:tcMar>
-              <w:top w:type="dxa" w:w="70"/>
-              <w:left w:type="dxa" w:w="110"/>
-              <w:bottom w:type="dxa" w:w="70"/>
-              <w:right w:type="dxa" w:w="110"/>
-            </w:tcMar>
-          </w:tcPr>
-          <w:p>
-            <w:pPr>
-              <w:spacing w:after="0"/>
-            </w:pPr>
-            <w:r>
-              <w:rPr>
-                <w:sz w:val="22"/>
-                <w:szCs w:val="22"/>
-              </w:rPr>
-              <w:t xml:space="preserve"/>
-            </w:r>
-          </w:p>
-        </w:tc>
-        <w:tc>
-          <w:tcPr>
-            <w:tcW w:type="dxa" w:w="4793"/>
-            <w:tcMar>
-              <w:top w:type="dxa" w:w="70"/>
-              <w:left w:type="dxa" w:w="110"/>
-              <w:bottom w:type="dxa" w:w="70"/>
+            <w:tcW w:type="dxa" w:w="4903"/>
+            <w:tcMar>
+              <w:top w:type="dxa" w:w="60"/>
+              <w:left w:type="dxa" w:w="110"/>
+              <w:bottom w:type="dxa" w:w="60"/>
+              <w:right w:type="dxa" w:w="110"/>
+            </w:tcMar>
+          </w:tcPr>
+          <w:p>
+            <w:pPr>
+              <w:spacing w:after="0"/>
+            </w:pPr>
+            <w:r>
+              <w:rPr>
+                <w:sz w:val="22"/>
+                <w:szCs w:val="22"/>
+              </w:rPr>
+              <w:t xml:space="preserve"/>
+            </w:r>
+          </w:p>
+        </w:tc>
+        <w:tc>
+          <w:tcPr>
+            <w:tcW w:type="dxa" w:w="4903"/>
+            <w:tcMar>
+              <w:top w:type="dxa" w:w="60"/>
+              <w:left w:type="dxa" w:w="110"/>
+              <w:bottom w:type="dxa" w:w="60"/>
               <w:right w:type="dxa" w:w="110"/>
             </w:tcMar>
           </w:tcPr>
@@ -2280,15 +2319,15 @@
       </w:tr>
       <w:tr>
         <w:trPr>
-          <w:trHeight w:val="1150" w:hRule="atLeast"/>
+          <w:trHeight w:val="1000" w:hRule="atLeast"/>
         </w:trPr>
         <w:tc>
           <w:tcPr>
-            <w:tcW w:type="dxa" w:w="520"/>
-            <w:tcMar>
-              <w:top w:type="dxa" w:w="70"/>
-              <w:left w:type="dxa" w:w="110"/>
-              <w:bottom w:type="dxa" w:w="70"/>
+            <w:tcW w:type="dxa" w:w="500"/>
+            <w:tcMar>
+              <w:top w:type="dxa" w:w="60"/>
+              <w:left w:type="dxa" w:w="110"/>
+              <w:bottom w:type="dxa" w:w="60"/>
               <w:right w:type="dxa" w:w="110"/>
             </w:tcMar>
           </w:tcPr>
@@ -2311,34 +2350,34 @@
         </w:tc>
         <w:tc>
           <w:tcPr>
-            <w:tcW w:type="dxa" w:w="4793"/>
-            <w:tcMar>
-              <w:top w:type="dxa" w:w="70"/>
-              <w:left w:type="dxa" w:w="110"/>
-              <w:bottom w:type="dxa" w:w="70"/>
-              <w:right w:type="dxa" w:w="110"/>
-            </w:tcMar>
-          </w:tcPr>
-          <w:p>
-            <w:pPr>
-              <w:spacing w:after="0"/>
-            </w:pPr>
-            <w:r>
-              <w:rPr>
-                <w:sz w:val="22"/>
-                <w:szCs w:val="22"/>
-              </w:rPr>
-              <w:t xml:space="preserve"/>
-            </w:r>
-          </w:p>
-        </w:tc>
-        <w:tc>
-          <w:tcPr>
-            <w:tcW w:type="dxa" w:w="4793"/>
-            <w:tcMar>
-              <w:top w:type="dxa" w:w="70"/>
-              <w:left w:type="dxa" w:w="110"/>
-              <w:bottom w:type="dxa" w:w="70"/>
+            <w:tcW w:type="dxa" w:w="4903"/>
+            <w:tcMar>
+              <w:top w:type="dxa" w:w="60"/>
+              <w:left w:type="dxa" w:w="110"/>
+              <w:bottom w:type="dxa" w:w="60"/>
+              <w:right w:type="dxa" w:w="110"/>
+            </w:tcMar>
+          </w:tcPr>
+          <w:p>
+            <w:pPr>
+              <w:spacing w:after="0"/>
+            </w:pPr>
+            <w:r>
+              <w:rPr>
+                <w:sz w:val="22"/>
+                <w:szCs w:val="22"/>
+              </w:rPr>
+              <w:t xml:space="preserve"/>
+            </w:r>
+          </w:p>
+        </w:tc>
+        <w:tc>
+          <w:tcPr>
+            <w:tcW w:type="dxa" w:w="4903"/>
+            <w:tcMar>
+              <w:top w:type="dxa" w:w="60"/>
+              <w:left w:type="dxa" w:w="110"/>
+              <w:bottom w:type="dxa" w:w="60"/>
               <w:right w:type="dxa" w:w="110"/>
             </w:tcMar>
           </w:tcPr>
@@ -2358,15 +2397,15 @@
       </w:tr>
       <w:tr>
         <w:trPr>
-          <w:trHeight w:val="1150" w:hRule="atLeast"/>
+          <w:trHeight w:val="1000" w:hRule="atLeast"/>
         </w:trPr>
         <w:tc>
           <w:tcPr>
-            <w:tcW w:type="dxa" w:w="520"/>
-            <w:tcMar>
-              <w:top w:type="dxa" w:w="70"/>
-              <w:left w:type="dxa" w:w="110"/>
-              <w:bottom w:type="dxa" w:w="70"/>
+            <w:tcW w:type="dxa" w:w="500"/>
+            <w:tcMar>
+              <w:top w:type="dxa" w:w="60"/>
+              <w:left w:type="dxa" w:w="110"/>
+              <w:bottom w:type="dxa" w:w="60"/>
               <w:right w:type="dxa" w:w="110"/>
             </w:tcMar>
           </w:tcPr>
@@ -2389,34 +2428,34 @@
         </w:tc>
         <w:tc>
           <w:tcPr>
-            <w:tcW w:type="dxa" w:w="4793"/>
-            <w:tcMar>
-              <w:top w:type="dxa" w:w="70"/>
-              <w:left w:type="dxa" w:w="110"/>
-              <w:bottom w:type="dxa" w:w="70"/>
-              <w:right w:type="dxa" w:w="110"/>
-            </w:tcMar>
-          </w:tcPr>
-          <w:p>
-            <w:pPr>
-              <w:spacing w:after="0"/>
-            </w:pPr>
-            <w:r>
-              <w:rPr>
-                <w:sz w:val="22"/>
-                <w:szCs w:val="22"/>
-              </w:rPr>
-              <w:t xml:space="preserve"/>
-            </w:r>
-          </w:p>
-        </w:tc>
-        <w:tc>
-          <w:tcPr>
-            <w:tcW w:type="dxa" w:w="4793"/>
-            <w:tcMar>
-              <w:top w:type="dxa" w:w="70"/>
-              <w:left w:type="dxa" w:w="110"/>
-              <w:bottom w:type="dxa" w:w="70"/>
+            <w:tcW w:type="dxa" w:w="4903"/>
+            <w:tcMar>
+              <w:top w:type="dxa" w:w="60"/>
+              <w:left w:type="dxa" w:w="110"/>
+              <w:bottom w:type="dxa" w:w="60"/>
+              <w:right w:type="dxa" w:w="110"/>
+            </w:tcMar>
+          </w:tcPr>
+          <w:p>
+            <w:pPr>
+              <w:spacing w:after="0"/>
+            </w:pPr>
+            <w:r>
+              <w:rPr>
+                <w:sz w:val="22"/>
+                <w:szCs w:val="22"/>
+              </w:rPr>
+              <w:t xml:space="preserve"/>
+            </w:r>
+          </w:p>
+        </w:tc>
+        <w:tc>
+          <w:tcPr>
+            <w:tcW w:type="dxa" w:w="4903"/>
+            <w:tcMar>
+              <w:top w:type="dxa" w:w="60"/>
+              <w:left w:type="dxa" w:w="110"/>
+              <w:bottom w:type="dxa" w:w="60"/>
               <w:right w:type="dxa" w:w="110"/>
             </w:tcMar>
           </w:tcPr>
@@ -2437,12 +2476,12 @@
     </w:tbl>
     <w:p>
       <w:pPr>
-        <w:spacing w:after="180"/>
+        <w:spacing w:after="140"/>
       </w:pPr>
     </w:p>
     <w:sectPr>
       <w:pgSz w:w="11906" w:h="16838" w:orient="portrait"/>
-      <w:pgMar w:top="900" w:right="900" w:bottom="900" w:left="900" w:header="708" w:footer="708" w:gutter="0"/>
+      <w:pgMar w:top="800" w:right="800" w:bottom="800" w:left="800" w:header="708" w:footer="708" w:gutter="0"/>
       <w:pgNumType/>
       <w:docGrid w:linePitch="360"/>
     </w:sectPr>

</xml_diff>

<commit_message>
Planning sheet: the class prompts kept, no character names, a worked first example
Co-Authored-By: Claude Opus 5 <noreply@anthropic.com>
Claude-Session: https://claude.ai/code/session_01TX2KYiJGekMNoBBPASQh6e
</commit_message>
<xml_diff>
--- a/BoneSparrow-essay-planner.docx
+++ b/BoneSparrow-essay-planner.docx
@@ -144,7 +144,16 @@
                 <w:sz w:val="23"/>
                 <w:szCs w:val="23"/>
               </w:rPr>
-              <w:t xml:space="preserve">The Bone Sparrow shows that imagination helps Subhi survive. Discuss.</w:t>
+              <w:t xml:space="preserve">The Bone Sparrow shows us that imagination and friendship are essential for survival.</w:t>
+            </w:r>
+            <w:r>
+              <w:rPr>
+                <w:rFonts w:ascii="Calibri" w:cs="Calibri" w:eastAsia="Calibri" w:hAnsi="Calibri"/>
+                <w:color w:val="645D54"/>
+                <w:sz w:val="17"/>
+                <w:szCs w:val="17"/>
+              </w:rPr>
+              <w:t xml:space="preserve">      worked example</w:t>
             </w:r>
           </w:p>
         </w:tc>
@@ -298,33 +307,37 @@
             </w:pPr>
             <w:r>
               <w:rPr>
-                <w:sz w:val="22"/>
-                <w:szCs w:val="22"/>
-              </w:rPr>
-              <w:t xml:space="preserve"/>
-            </w:r>
-          </w:p>
-        </w:tc>
-        <w:tc>
-          <w:tcPr>
-            <w:tcW w:type="dxa" w:w="4903"/>
-            <w:tcMar>
-              <w:top w:type="dxa" w:w="60"/>
-              <w:left w:type="dxa" w:w="110"/>
-              <w:bottom w:type="dxa" w:w="60"/>
-              <w:right w:type="dxa" w:w="110"/>
-            </w:tcMar>
-          </w:tcPr>
-          <w:p>
-            <w:pPr>
-              <w:spacing w:after="0"/>
-            </w:pPr>
-            <w:r>
-              <w:rPr>
-                <w:sz w:val="22"/>
-                <w:szCs w:val="22"/>
-              </w:rPr>
-              <w:t xml:space="preserve"/>
+                <w:rFonts w:ascii="Georgia" w:cs="Georgia" w:eastAsia="Georgia" w:hAnsi="Georgia"/>
+                <w:color w:val="1E211F"/>
+                <w:sz w:val="20"/>
+                <w:szCs w:val="20"/>
+              </w:rPr>
+              <w:t xml:space="preserve">imagination gives him somewhere to go when he cannot leave</w:t>
+            </w:r>
+          </w:p>
+        </w:tc>
+        <w:tc>
+          <w:tcPr>
+            <w:tcW w:type="dxa" w:w="4903"/>
+            <w:tcMar>
+              <w:top w:type="dxa" w:w="60"/>
+              <w:left w:type="dxa" w:w="110"/>
+              <w:bottom w:type="dxa" w:w="60"/>
+              <w:right w:type="dxa" w:w="110"/>
+            </w:tcMar>
+          </w:tcPr>
+          <w:p>
+            <w:pPr>
+              <w:spacing w:after="0"/>
+            </w:pPr>
+            <w:r>
+              <w:rPr>
+                <w:rFonts w:ascii="Georgia" w:cs="Georgia" w:eastAsia="Georgia" w:hAnsi="Georgia"/>
+                <w:color w:val="1E211F"/>
+                <w:sz w:val="20"/>
+                <w:szCs w:val="20"/>
+              </w:rPr>
+              <w:t xml:space="preserve">at night the dirt turns into a beautiful ocean (ch 1)</w:t>
             </w:r>
           </w:p>
         </w:tc>
@@ -376,33 +389,37 @@
             </w:pPr>
             <w:r>
               <w:rPr>
-                <w:sz w:val="22"/>
-                <w:szCs w:val="22"/>
-              </w:rPr>
-              <w:t xml:space="preserve"/>
-            </w:r>
-          </w:p>
-        </w:tc>
-        <w:tc>
-          <w:tcPr>
-            <w:tcW w:type="dxa" w:w="4903"/>
-            <w:tcMar>
-              <w:top w:type="dxa" w:w="60"/>
-              <w:left w:type="dxa" w:w="110"/>
-              <w:bottom w:type="dxa" w:w="60"/>
-              <w:right w:type="dxa" w:w="110"/>
-            </w:tcMar>
-          </w:tcPr>
-          <w:p>
-            <w:pPr>
-              <w:spacing w:after="0"/>
-            </w:pPr>
-            <w:r>
-              <w:rPr>
-                <w:sz w:val="22"/>
-                <w:szCs w:val="22"/>
-              </w:rPr>
-              <w:t xml:space="preserve"/>
+                <w:rFonts w:ascii="Georgia" w:cs="Georgia" w:eastAsia="Georgia" w:hAnsi="Georgia"/>
+                <w:color w:val="1E211F"/>
+                <w:sz w:val="20"/>
+                <w:szCs w:val="20"/>
+              </w:rPr>
+              <w:t xml:space="preserve">a friend who keeps her promise gives him something to count on</w:t>
+            </w:r>
+          </w:p>
+        </w:tc>
+        <w:tc>
+          <w:tcPr>
+            <w:tcW w:type="dxa" w:w="4903"/>
+            <w:tcMar>
+              <w:top w:type="dxa" w:w="60"/>
+              <w:left w:type="dxa" w:w="110"/>
+              <w:bottom w:type="dxa" w:w="60"/>
+              <w:right w:type="dxa" w:w="110"/>
+            </w:tcMar>
+          </w:tcPr>
+          <w:p>
+            <w:pPr>
+              <w:spacing w:after="0"/>
+            </w:pPr>
+            <w:r>
+              <w:rPr>
+                <w:rFonts w:ascii="Georgia" w:cs="Georgia" w:eastAsia="Georgia" w:hAnsi="Georgia"/>
+                <w:color w:val="1E211F"/>
+                <w:sz w:val="20"/>
+                <w:szCs w:val="20"/>
+              </w:rPr>
+              <w:t xml:space="preserve">“the kind of person that keeps a promise” (ch 14)</w:t>
             </w:r>
           </w:p>
         </w:tc>
@@ -454,33 +471,37 @@
             </w:pPr>
             <w:r>
               <w:rPr>
-                <w:sz w:val="22"/>
-                <w:szCs w:val="22"/>
-              </w:rPr>
-              <w:t xml:space="preserve"/>
-            </w:r>
-          </w:p>
-        </w:tc>
-        <w:tc>
-          <w:tcPr>
-            <w:tcW w:type="dxa" w:w="4903"/>
-            <w:tcMar>
-              <w:top w:type="dxa" w:w="60"/>
-              <w:left w:type="dxa" w:w="110"/>
-              <w:bottom w:type="dxa" w:w="60"/>
-              <w:right w:type="dxa" w:w="110"/>
-            </w:tcMar>
-          </w:tcPr>
-          <w:p>
-            <w:pPr>
-              <w:spacing w:after="0"/>
-            </w:pPr>
-            <w:r>
-              <w:rPr>
-                <w:sz w:val="22"/>
-                <w:szCs w:val="22"/>
-              </w:rPr>
-              <w:t xml:space="preserve"/>
+                <w:rFonts w:ascii="Georgia" w:cs="Georgia" w:eastAsia="Georgia" w:hAnsi="Georgia"/>
+                <w:color w:val="1E211F"/>
+                <w:sz w:val="20"/>
+                <w:szCs w:val="20"/>
+              </w:rPr>
+              <w:t xml:space="preserve">together they give him what the camp cannot take away</w:t>
+            </w:r>
+          </w:p>
+        </w:tc>
+        <w:tc>
+          <w:tcPr>
+            <w:tcW w:type="dxa" w:w="4903"/>
+            <w:tcMar>
+              <w:top w:type="dxa" w:w="60"/>
+              <w:left w:type="dxa" w:w="110"/>
+              <w:bottom w:type="dxa" w:w="60"/>
+              <w:right w:type="dxa" w:w="110"/>
+            </w:tcMar>
+          </w:tcPr>
+          <w:p>
+            <w:pPr>
+              <w:spacing w:after="0"/>
+            </w:pPr>
+            <w:r>
+              <w:rPr>
+                <w:rFonts w:ascii="Georgia" w:cs="Georgia" w:eastAsia="Georgia" w:hAnsi="Georgia"/>
+                <w:color w:val="1E211F"/>
+                <w:sz w:val="20"/>
+                <w:szCs w:val="20"/>
+              </w:rPr>
+              <w:t xml:space="preserve">a real book gives him “a sort of brave” (ch 10)</w:t>
             </w:r>
           </w:p>
         </w:tc>
@@ -540,7 +561,7 @@
                 <w:sz w:val="23"/>
                 <w:szCs w:val="23"/>
               </w:rPr>
-              <w:t xml:space="preserve">Friendship changes Subhi’s life in The Bone Sparrow. Discuss.</w:t>
+              <w:t xml:space="preserve">In The Bone Sparrow, power comes in many forms. Discuss.</w:t>
             </w:r>
           </w:p>
         </w:tc>
@@ -936,7 +957,7 @@
                 <w:sz w:val="23"/>
                 <w:szCs w:val="23"/>
               </w:rPr>
-              <w:t xml:space="preserve">In The Bone Sparrow, the people with power control everything. Do you agree?</w:t>
+              <w:t xml:space="preserve">Explore how loneliness and friendship shape the lives of the characters in The Bone Sparrow.</w:t>
             </w:r>
           </w:p>
         </w:tc>
@@ -1295,10 +1316,10 @@
       <w:tblPr>
         <w:tblW w:type="dxa" w:w="10306"/>
         <w:tblBorders>
-          <w:top w:val="single" w:color="1F5C33" w:sz="8"/>
-          <w:left w:val="single" w:color="1F5C33" w:sz="8"/>
-          <w:bottom w:val="single" w:color="1F5C33" w:sz="8"/>
-          <w:right w:val="single" w:color="1F5C33" w:sz="8"/>
+          <w:top w:val="single" w:color="0B447C" w:sz="8"/>
+          <w:left w:val="single" w:color="0B447C" w:sz="8"/>
+          <w:bottom w:val="single" w:color="0B447C" w:sz="8"/>
+          <w:right w:val="single" w:color="0B447C" w:sz="8"/>
           <w:insideH w:val="single" w:color="auto" w:sz="4"/>
           <w:insideV w:val="single" w:color="auto" w:sz="4"/>
         </w:tblBorders>
@@ -1310,7 +1331,7 @@
         <w:tc>
           <w:tcPr>
             <w:tcW w:type="dxa" w:w="10306"/>
-            <w:shd w:fill="DFF0E2" w:color="auto" w:val="clear"/>
+            <w:shd w:fill="D6EAFC" w:color="auto" w:val="clear"/>
             <w:tcMar>
               <w:top w:type="dxa" w:w="110"/>
               <w:left w:type="dxa" w:w="170"/>
@@ -1336,11 +1357,11 @@
             <w:r>
               <w:rPr>
                 <w:rFonts w:ascii="Georgia" w:cs="Georgia" w:eastAsia="Georgia" w:hAnsi="Georgia"/>
-                <w:color w:val="1F5C33"/>
+                <w:color w:val="0B447C"/>
                 <w:sz w:val="23"/>
                 <w:szCs w:val="23"/>
               </w:rPr>
-              <w:t xml:space="preserve">How does Fraillon make the reader care about Subhi?</w:t>
+              <w:t xml:space="preserve">What does The Bone Sparrow show about the importance of stories and family?</w:t>
             </w:r>
           </w:p>
         </w:tc>
@@ -1691,10 +1712,10 @@
       <w:tblPr>
         <w:tblW w:type="dxa" w:w="10306"/>
         <w:tblBorders>
-          <w:top w:val="single" w:color="0B447C" w:sz="8"/>
-          <w:left w:val="single" w:color="0B447C" w:sz="8"/>
-          <w:bottom w:val="single" w:color="0B447C" w:sz="8"/>
-          <w:right w:val="single" w:color="0B447C" w:sz="8"/>
+          <w:top w:val="single" w:color="1F5C33" w:sz="8"/>
+          <w:left w:val="single" w:color="1F5C33" w:sz="8"/>
+          <w:bottom w:val="single" w:color="1F5C33" w:sz="8"/>
+          <w:right w:val="single" w:color="1F5C33" w:sz="8"/>
           <w:insideH w:val="single" w:color="auto" w:sz="4"/>
           <w:insideV w:val="single" w:color="auto" w:sz="4"/>
         </w:tblBorders>
@@ -1706,7 +1727,7 @@
         <w:tc>
           <w:tcPr>
             <w:tcW w:type="dxa" w:w="10306"/>
-            <w:shd w:fill="D6EAFC" w:color="auto" w:val="clear"/>
+            <w:shd w:fill="DFF0E2" w:color="auto" w:val="clear"/>
             <w:tcMar>
               <w:top w:type="dxa" w:w="110"/>
               <w:left w:type="dxa" w:w="170"/>
@@ -1732,11 +1753,11 @@
             <w:r>
               <w:rPr>
                 <w:rFonts w:ascii="Georgia" w:cs="Georgia" w:eastAsia="Georgia" w:hAnsi="Georgia"/>
-                <w:color w:val="0B447C"/>
+                <w:color w:val="1F5C33"/>
                 <w:sz w:val="23"/>
                 <w:szCs w:val="23"/>
               </w:rPr>
-              <w:t xml:space="preserve">How is hope shown in The Bone Sparrow?</w:t>
+              <w:t xml:space="preserve">How does Fraillon make the reader care about the people in the camp?</w:t>
             </w:r>
           </w:p>
         </w:tc>

</xml_diff>